<commit_message>
modified:   doc/CV_Radko_Y_IT_spec_EN.docx 	modified:   doc/CV_Radko_Y_IT_spec_RU.docx 	modified:   index.html 	modified:   ua/index.html
</commit_message>
<xml_diff>
--- a/doc/CV_Radko_Y_IT_spec_RU.docx
+++ b/doc/CV_Radko_Y_IT_spec_RU.docx
@@ -26,6 +26,77 @@
           <w:smallCaps w:val="0"/>
           <w:strike w:val="0"/>
           <w:color w:val="000000"/>
+          <w:sz w:val="36"/>
+          <w:szCs w:val="36"/>
+          <w:u w:val="none"/>
+          <w:shd w:fill="auto" w:val="clear"/>
+          <w:vertAlign w:val="baseline"/>
+        </w:rPr>
+      </w:pPr>
+      <w:r>
+        <w:rPr>
+          <w:rFonts w:ascii="Calibri" w:cs="Calibri" w:eastAsia="Calibri" w:hAnsi="Calibri"/>
+          <w:b w:val="1"/>
+          <w:i w:val="0"/>
+          <w:smallCaps w:val="0"/>
+          <w:strike w:val="0"/>
+          <w:color w:val="000000"/>
+          <w:sz w:val="28"/>
+          <w:szCs w:val="28"/>
+          <w:u w:val="none"/>
+          <w:shd w:fill="auto" w:val="clear"/>
+          <w:vertAlign w:val="baseline"/>
+          <w:rtl w:val="0"/>
+        </w:rPr>
+        <w:t xml:space="preserve"> </w:t>
+      </w:r>
+      <w:r>
+        <w:rPr>
+          <w:rFonts w:ascii="Calibri" w:cs="Calibri" w:eastAsia="Calibri" w:hAnsi="Calibri"/>
+          <w:b w:val="1"/>
+          <w:i w:val="0"/>
+          <w:smallCaps w:val="0"/>
+          <w:strike w:val="0"/>
+          <w:color w:val="000000"/>
+          <w:sz w:val="36"/>
+          <w:szCs w:val="36"/>
+          <w:u w:val="none"/>
+          <w:shd w:fill="auto" w:val="clear"/>
+          <w:vertAlign w:val="baseline"/>
+          <w:rtl w:val="0"/>
+        </w:rPr>
+        <w:t xml:space="preserve">Резюме </w:t>
+      </w:r>
+      <w:r>
+        <w:rPr>
+          <w:rtl w:val="0"/>
+        </w:rPr>
+      </w:r>
+    </w:p>
+    <w:p>
+      <w:pPr>
+        <w:keepNext w:val="0"/>
+        <w:keepLines w:val="0"/>
+        <w:pageBreakBefore w:val="0"/>
+        <w:widowControl w:val="1"/>
+        <w:pBdr>
+          <w:top w:space="0" w:sz="0" w:val="nil"/>
+          <w:left w:space="0" w:sz="0" w:val="nil"/>
+          <w:bottom w:space="0" w:sz="0" w:val="nil"/>
+          <w:right w:space="0" w:sz="0" w:val="nil"/>
+          <w:between w:space="0" w:sz="0" w:val="nil"/>
+        </w:pBdr>
+        <w:shd w:fill="auto" w:val="clear"/>
+        <w:spacing w:after="120" w:before="0" w:line="264" w:lineRule="auto"/>
+        <w:ind w:left="0" w:right="0" w:firstLine="0"/>
+        <w:jc w:val="left"/>
+        <w:rPr>
+          <w:rFonts w:ascii="Calibri" w:cs="Calibri" w:eastAsia="Calibri" w:hAnsi="Calibri"/>
+          <w:b w:val="0"/>
+          <w:i w:val="0"/>
+          <w:smallCaps w:val="0"/>
+          <w:strike w:val="0"/>
+          <w:color w:val="000000"/>
           <w:sz w:val="32"/>
           <w:szCs w:val="32"/>
           <w:u w:val="none"/>
@@ -41,23 +112,6 @@
           <w:smallCaps w:val="0"/>
           <w:strike w:val="0"/>
           <w:color w:val="000000"/>
-          <w:sz w:val="28"/>
-          <w:szCs w:val="28"/>
-          <w:u w:val="none"/>
-          <w:shd w:fill="auto" w:val="clear"/>
-          <w:vertAlign w:val="baseline"/>
-          <w:rtl w:val="0"/>
-        </w:rPr>
-        <w:t xml:space="preserve"> </w:t>
-      </w:r>
-      <w:r>
-        <w:rPr>
-          <w:rFonts w:ascii="Calibri" w:cs="Calibri" w:eastAsia="Calibri" w:hAnsi="Calibri"/>
-          <w:b w:val="1"/>
-          <w:i w:val="0"/>
-          <w:smallCaps w:val="0"/>
-          <w:strike w:val="0"/>
-          <w:color w:val="000000"/>
           <w:sz w:val="32"/>
           <w:szCs w:val="32"/>
           <w:u w:val="none"/>
@@ -65,29 +119,29 @@
           <w:vertAlign w:val="baseline"/>
           <w:rtl w:val="0"/>
         </w:rPr>
-        <w:t xml:space="preserve">Резюме </w:t>
-      </w:r>
-      <w:r>
-        <w:rPr>
-          <w:rtl w:val="0"/>
-        </w:rPr>
-      </w:r>
-    </w:p>
-    <w:p>
-      <w:pPr>
-        <w:keepNext w:val="0"/>
-        <w:keepLines w:val="0"/>
-        <w:pageBreakBefore w:val="0"/>
-        <w:widowControl w:val="1"/>
-        <w:pBdr>
-          <w:top w:space="0" w:sz="0" w:val="nil"/>
-          <w:left w:space="0" w:sz="0" w:val="nil"/>
-          <w:bottom w:space="0" w:sz="0" w:val="nil"/>
-          <w:right w:space="0" w:sz="0" w:val="nil"/>
-          <w:between w:space="0" w:sz="0" w:val="nil"/>
-        </w:pBdr>
-        <w:shd w:fill="auto" w:val="clear"/>
-        <w:spacing w:after="120" w:before="0" w:line="264" w:lineRule="auto"/>
+        <w:t xml:space="preserve">Радько Евгений Юрьевич</w:t>
+      </w:r>
+      <w:r>
+        <w:rPr>
+          <w:rtl w:val="0"/>
+        </w:rPr>
+      </w:r>
+    </w:p>
+    <w:p>
+      <w:pPr>
+        <w:keepNext w:val="0"/>
+        <w:keepLines w:val="0"/>
+        <w:pageBreakBefore w:val="0"/>
+        <w:widowControl w:val="1"/>
+        <w:pBdr>
+          <w:top w:space="0" w:sz="0" w:val="nil"/>
+          <w:left w:space="0" w:sz="0" w:val="nil"/>
+          <w:bottom w:space="0" w:sz="0" w:val="nil"/>
+          <w:right w:space="0" w:sz="0" w:val="nil"/>
+          <w:between w:space="0" w:sz="0" w:val="nil"/>
+        </w:pBdr>
+        <w:shd w:fill="auto" w:val="clear"/>
+        <w:spacing w:after="0" w:before="0" w:line="240" w:lineRule="auto"/>
         <w:ind w:left="0" w:right="0" w:firstLine="0"/>
         <w:jc w:val="left"/>
         <w:rPr>
@@ -97,8 +151,8 @@
           <w:smallCaps w:val="0"/>
           <w:strike w:val="0"/>
           <w:color w:val="000000"/>
-          <w:sz w:val="28"/>
-          <w:szCs w:val="28"/>
+          <w:sz w:val="24"/>
+          <w:szCs w:val="24"/>
           <w:u w:val="none"/>
           <w:shd w:fill="auto" w:val="clear"/>
           <w:vertAlign w:val="baseline"/>
@@ -112,14 +166,30 @@
           <w:smallCaps w:val="0"/>
           <w:strike w:val="0"/>
           <w:color w:val="000000"/>
-          <w:sz w:val="28"/>
-          <w:szCs w:val="28"/>
-          <w:u w:val="none"/>
-          <w:shd w:fill="auto" w:val="clear"/>
-          <w:vertAlign w:val="baseline"/>
-          <w:rtl w:val="0"/>
-        </w:rPr>
-        <w:t xml:space="preserve">Радько Евгений Юрьевич</w:t>
+          <w:sz w:val="24"/>
+          <w:szCs w:val="24"/>
+          <w:u w:val="none"/>
+          <w:shd w:fill="auto" w:val="clear"/>
+          <w:vertAlign w:val="baseline"/>
+          <w:rtl w:val="0"/>
+        </w:rPr>
+        <w:t xml:space="preserve">Желаемая должность: </w:t>
+      </w:r>
+      <w:r>
+        <w:rPr>
+          <w:sz w:val="24"/>
+          <w:szCs w:val="24"/>
+          <w:rtl w:val="0"/>
+        </w:rPr>
+        <w:t xml:space="preserve">DevOps Engineer, Frontend Developer, Backend developer</w:t>
+      </w:r>
+      <w:r>
+        <w:rPr>
+          <w:sz w:val="24"/>
+          <w:szCs w:val="24"/>
+          <w:rtl w:val="0"/>
+        </w:rPr>
+        <w:t xml:space="preserve">.</w:t>
       </w:r>
       <w:r>
         <w:rPr>
@@ -161,49 +231,19 @@
       <w:r>
         <w:rPr>
           <w:rFonts w:ascii="Calibri" w:cs="Calibri" w:eastAsia="Calibri" w:hAnsi="Calibri"/>
-          <w:b w:val="1"/>
-          <w:i w:val="0"/>
-          <w:smallCaps w:val="0"/>
-          <w:strike w:val="0"/>
-          <w:color w:val="000000"/>
-          <w:sz w:val="24"/>
-          <w:szCs w:val="24"/>
-          <w:u w:val="none"/>
-          <w:shd w:fill="auto" w:val="clear"/>
-          <w:vertAlign w:val="baseline"/>
-          <w:rtl w:val="0"/>
-        </w:rPr>
-        <w:t xml:space="preserve">Желаемая должность: </w:t>
-      </w:r>
-      <w:r>
-        <w:rPr>
-          <w:rFonts w:ascii="Calibri" w:cs="Calibri" w:eastAsia="Calibri" w:hAnsi="Calibri"/>
-          <w:b w:val="0"/>
-          <w:i w:val="0"/>
-          <w:smallCaps w:val="0"/>
-          <w:strike w:val="0"/>
-          <w:color w:val="000000"/>
-          <w:sz w:val="24"/>
-          <w:szCs w:val="24"/>
-          <w:u w:val="none"/>
-          <w:shd w:fill="auto" w:val="clear"/>
-          <w:vertAlign w:val="baseline"/>
-          <w:rtl w:val="0"/>
-        </w:rPr>
-        <w:t xml:space="preserve">системный администратор, </w:t>
-      </w:r>
-      <w:r>
-        <w:rPr>
-          <w:sz w:val="24"/>
-          <w:szCs w:val="24"/>
-          <w:rtl w:val="0"/>
-        </w:rPr>
-        <w:t xml:space="preserve">IT специалист, Junior DevOps.</w:t>
-      </w:r>
-      <w:r>
-        <w:rPr>
-          <w:rtl w:val="0"/>
-        </w:rPr>
+          <w:b w:val="0"/>
+          <w:i w:val="0"/>
+          <w:smallCaps w:val="0"/>
+          <w:strike w:val="0"/>
+          <w:color w:val="000000"/>
+          <w:sz w:val="24"/>
+          <w:szCs w:val="24"/>
+          <w:u w:val="none"/>
+          <w:shd w:fill="auto" w:val="clear"/>
+          <w:vertAlign w:val="baseline"/>
+          <w:rtl w:val="0"/>
+        </w:rPr>
+        <w:t xml:space="preserve">Дата рождения: 26.10.1984 г.</w:t>
       </w:r>
     </w:p>
     <w:p>
@@ -252,7 +292,20 @@
           <w:vertAlign w:val="baseline"/>
           <w:rtl w:val="0"/>
         </w:rPr>
-        <w:t xml:space="preserve">Дата рождения: 26.10.1984 г.</w:t>
+        <w:t xml:space="preserve">Проживание: Украина, г. </w:t>
+      </w:r>
+      <w:r>
+        <w:rPr>
+          <w:sz w:val="24"/>
+          <w:szCs w:val="24"/>
+          <w:rtl w:val="0"/>
+        </w:rPr>
+        <w:t xml:space="preserve">Терновка</w:t>
+      </w:r>
+      <w:r>
+        <w:rPr>
+          <w:rtl w:val="0"/>
+        </w:rPr>
       </w:r>
     </w:p>
     <w:p>
@@ -301,130 +354,7 @@
           <w:vertAlign w:val="baseline"/>
           <w:rtl w:val="0"/>
         </w:rPr>
-        <w:t xml:space="preserve">Проживание: Украина, г. Дн</w:t>
-      </w:r>
-      <w:r>
-        <w:rPr>
-          <w:sz w:val="24"/>
-          <w:szCs w:val="24"/>
-          <w:rtl w:val="0"/>
-        </w:rPr>
-        <w:t xml:space="preserve">е</w:t>
-      </w:r>
-      <w:r>
-        <w:rPr>
-          <w:rFonts w:ascii="Calibri" w:cs="Calibri" w:eastAsia="Calibri" w:hAnsi="Calibri"/>
-          <w:b w:val="0"/>
-          <w:i w:val="0"/>
-          <w:smallCaps w:val="0"/>
-          <w:strike w:val="0"/>
-          <w:color w:val="000000"/>
-          <w:sz w:val="24"/>
-          <w:szCs w:val="24"/>
-          <w:u w:val="none"/>
-          <w:shd w:fill="auto" w:val="clear"/>
-          <w:vertAlign w:val="baseline"/>
-          <w:rtl w:val="0"/>
-        </w:rPr>
-        <w:t xml:space="preserve">пр</w:t>
-      </w:r>
-    </w:p>
-    <w:p>
-      <w:pPr>
-        <w:keepNext w:val="0"/>
-        <w:keepLines w:val="0"/>
-        <w:pageBreakBefore w:val="0"/>
-        <w:widowControl w:val="1"/>
-        <w:pBdr>
-          <w:top w:space="0" w:sz="0" w:val="nil"/>
-          <w:left w:space="0" w:sz="0" w:val="nil"/>
-          <w:bottom w:space="0" w:sz="0" w:val="nil"/>
-          <w:right w:space="0" w:sz="0" w:val="nil"/>
-          <w:between w:space="0" w:sz="0" w:val="nil"/>
-        </w:pBdr>
-        <w:shd w:fill="auto" w:val="clear"/>
-        <w:spacing w:after="0" w:before="0" w:line="240" w:lineRule="auto"/>
-        <w:ind w:left="0" w:right="0" w:firstLine="0"/>
-        <w:jc w:val="left"/>
-        <w:rPr>
-          <w:rFonts w:ascii="Calibri" w:cs="Calibri" w:eastAsia="Calibri" w:hAnsi="Calibri"/>
-          <w:b w:val="0"/>
-          <w:i w:val="0"/>
-          <w:smallCaps w:val="0"/>
-          <w:strike w:val="0"/>
-          <w:color w:val="000000"/>
-          <w:sz w:val="24"/>
-          <w:szCs w:val="24"/>
-          <w:u w:val="none"/>
-          <w:shd w:fill="auto" w:val="clear"/>
-          <w:vertAlign w:val="baseline"/>
-        </w:rPr>
-      </w:pPr>
-      <w:r>
-        <w:rPr>
-          <w:rFonts w:ascii="Calibri" w:cs="Calibri" w:eastAsia="Calibri" w:hAnsi="Calibri"/>
-          <w:b w:val="0"/>
-          <w:i w:val="0"/>
-          <w:smallCaps w:val="0"/>
-          <w:strike w:val="0"/>
-          <w:color w:val="000000"/>
-          <w:sz w:val="24"/>
-          <w:szCs w:val="24"/>
-          <w:u w:val="none"/>
-          <w:shd w:fill="auto" w:val="clear"/>
-          <w:vertAlign w:val="baseline"/>
-          <w:rtl w:val="0"/>
-        </w:rPr>
-        <w:t xml:space="preserve">Готов к командировкам. Готов к переезду.</w:t>
-      </w:r>
-    </w:p>
-    <w:p>
-      <w:pPr>
-        <w:keepNext w:val="0"/>
-        <w:keepLines w:val="0"/>
-        <w:pageBreakBefore w:val="0"/>
-        <w:widowControl w:val="1"/>
-        <w:pBdr>
-          <w:top w:space="0" w:sz="0" w:val="nil"/>
-          <w:left w:space="0" w:sz="0" w:val="nil"/>
-          <w:bottom w:space="0" w:sz="0" w:val="nil"/>
-          <w:right w:space="0" w:sz="0" w:val="nil"/>
-          <w:between w:space="0" w:sz="0" w:val="nil"/>
-        </w:pBdr>
-        <w:shd w:fill="auto" w:val="clear"/>
-        <w:spacing w:after="0" w:before="0" w:line="240" w:lineRule="auto"/>
-        <w:ind w:left="0" w:right="0" w:firstLine="0"/>
-        <w:jc w:val="left"/>
-        <w:rPr>
-          <w:rFonts w:ascii="Calibri" w:cs="Calibri" w:eastAsia="Calibri" w:hAnsi="Calibri"/>
-          <w:b w:val="0"/>
-          <w:i w:val="0"/>
-          <w:smallCaps w:val="0"/>
-          <w:strike w:val="0"/>
-          <w:color w:val="000000"/>
-          <w:sz w:val="24"/>
-          <w:szCs w:val="24"/>
-          <w:u w:val="none"/>
-          <w:shd w:fill="auto" w:val="clear"/>
-          <w:vertAlign w:val="baseline"/>
-        </w:rPr>
-      </w:pPr>
-      <w:r>
-        <w:rPr>
-          <w:rFonts w:ascii="Calibri" w:cs="Calibri" w:eastAsia="Calibri" w:hAnsi="Calibri"/>
-          <w:b w:val="0"/>
-          <w:i w:val="0"/>
-          <w:smallCaps w:val="0"/>
-          <w:strike w:val="0"/>
-          <w:color w:val="000000"/>
-          <w:sz w:val="24"/>
-          <w:szCs w:val="24"/>
-          <w:u w:val="none"/>
-          <w:shd w:fill="auto" w:val="clear"/>
-          <w:vertAlign w:val="baseline"/>
-          <w:rtl w:val="0"/>
-        </w:rPr>
-        <w:t xml:space="preserve">     </w:t>
+        <w:t xml:space="preserve">Готов к командировкам. Готов к переезду.     </w:t>
       </w:r>
     </w:p>
     <w:p>
@@ -788,21 +718,12 @@
           <w:between w:space="0" w:sz="0" w:val="nil"/>
         </w:pBdr>
         <w:shd w:fill="auto" w:val="clear"/>
-        <w:spacing w:after="120" w:before="0" w:line="264" w:lineRule="auto"/>
+        <w:spacing w:after="0" w:before="0" w:line="240" w:lineRule="auto"/>
         <w:ind w:left="0" w:right="0" w:firstLine="0"/>
         <w:jc w:val="left"/>
         <w:rPr>
-          <w:rFonts w:ascii="Calibri" w:cs="Calibri" w:eastAsia="Calibri" w:hAnsi="Calibri"/>
-          <w:b w:val="0"/>
-          <w:i w:val="0"/>
-          <w:smallCaps w:val="0"/>
-          <w:strike w:val="0"/>
-          <w:color w:val="000000"/>
-          <w:sz w:val="24"/>
-          <w:szCs w:val="24"/>
-          <w:u w:val="none"/>
-          <w:shd w:fill="auto" w:val="clear"/>
-          <w:vertAlign w:val="baseline"/>
+          <w:sz w:val="24"/>
+          <w:szCs w:val="24"/>
         </w:rPr>
       </w:pPr>
       <w:r>
@@ -835,8 +756,8 @@
           <w:smallCaps w:val="0"/>
           <w:strike w:val="0"/>
           <w:color w:val="000000"/>
-          <w:sz w:val="24"/>
-          <w:szCs w:val="24"/>
+          <w:sz w:val="28"/>
+          <w:szCs w:val="28"/>
           <w:u w:val="none"/>
           <w:shd w:fill="auto" w:val="clear"/>
           <w:vertAlign w:val="baseline"/>
@@ -850,8 +771,8 @@
           <w:smallCaps w:val="0"/>
           <w:strike w:val="0"/>
           <w:color w:val="000000"/>
-          <w:sz w:val="24"/>
-          <w:szCs w:val="24"/>
+          <w:sz w:val="28"/>
+          <w:szCs w:val="28"/>
           <w:u w:val="none"/>
           <w:shd w:fill="auto" w:val="clear"/>
           <w:vertAlign w:val="baseline"/>
@@ -972,32 +893,7 @@
           <w:szCs w:val="24"/>
           <w:rtl w:val="0"/>
         </w:rPr>
-        <w:t xml:space="preserve">серверов</w:t>
-      </w:r>
-      <w:r>
-        <w:rPr>
-          <w:rFonts w:ascii="Calibri" w:cs="Calibri" w:eastAsia="Calibri" w:hAnsi="Calibri"/>
-          <w:b w:val="0"/>
-          <w:i w:val="0"/>
-          <w:smallCaps w:val="0"/>
-          <w:strike w:val="0"/>
-          <w:color w:val="000000"/>
-          <w:sz w:val="24"/>
-          <w:szCs w:val="24"/>
-          <w:u w:val="none"/>
-          <w:shd w:fill="auto" w:val="clear"/>
-          <w:vertAlign w:val="baseline"/>
-          <w:rtl w:val="0"/>
-        </w:rPr>
-        <w:t xml:space="preserve"> под управлением </w:t>
-      </w:r>
-      <w:r>
-        <w:rPr>
-          <w:sz w:val="24"/>
-          <w:szCs w:val="24"/>
-          <w:rtl w:val="0"/>
-        </w:rPr>
-        <w:t xml:space="preserve">LEMP.</w:t>
+        <w:t xml:space="preserve">LEMP серверов.</w:t>
       </w:r>
     </w:p>
     <w:p>
@@ -1039,7 +935,7 @@
           <w:szCs w:val="24"/>
           <w:rtl w:val="0"/>
         </w:rPr>
-        <w:t xml:space="preserve">Контейнеризация и виртуализация на серверах. Docker, Kubernetes.</w:t>
+        <w:t xml:space="preserve">Контейнеризация и виртуализация. Kubernetes, Docker, KVM, VMWare, Virtualbox, Hyper-V.</w:t>
       </w:r>
     </w:p>
     <w:p>
@@ -1081,7 +977,7 @@
           <w:szCs w:val="24"/>
           <w:rtl w:val="0"/>
         </w:rPr>
-        <w:t xml:space="preserve">Автоматизирование процессов (Jenkins), написание скриптов bash. Установка и конфигурирования обновлений операционной системы и прикладного программного обеспечения. Опыт работы с системой контроля версий GIT. </w:t>
+        <w:t xml:space="preserve">Автоматизирование процессов. Jenkins, Ansible, Terraform, написание скриптов bash, основы Python. Опыт работы с системой контроля версий GIT. </w:t>
       </w:r>
     </w:p>
     <w:p>
@@ -1132,57 +1028,7 @@
           <w:vertAlign w:val="baseline"/>
           <w:rtl w:val="0"/>
         </w:rPr>
-        <w:t xml:space="preserve">Настройка почтов</w:t>
-      </w:r>
-      <w:r>
-        <w:rPr>
-          <w:sz w:val="24"/>
-          <w:szCs w:val="24"/>
-          <w:rtl w:val="0"/>
-        </w:rPr>
-        <w:t xml:space="preserve">ого</w:t>
-      </w:r>
-      <w:r>
-        <w:rPr>
-          <w:rFonts w:ascii="Calibri" w:cs="Calibri" w:eastAsia="Calibri" w:hAnsi="Calibri"/>
-          <w:b w:val="0"/>
-          <w:i w:val="0"/>
-          <w:smallCaps w:val="0"/>
-          <w:strike w:val="0"/>
-          <w:color w:val="000000"/>
-          <w:sz w:val="24"/>
-          <w:szCs w:val="24"/>
-          <w:u w:val="none"/>
-          <w:shd w:fill="auto" w:val="clear"/>
-          <w:vertAlign w:val="baseline"/>
-          <w:rtl w:val="0"/>
-        </w:rPr>
-        <w:t xml:space="preserve"> сервер</w:t>
-      </w:r>
-      <w:r>
-        <w:rPr>
-          <w:sz w:val="24"/>
-          <w:szCs w:val="24"/>
-          <w:rtl w:val="0"/>
-        </w:rPr>
-        <w:t xml:space="preserve">а,</w:t>
-      </w:r>
-      <w:r>
-        <w:rPr>
-          <w:rFonts w:ascii="Calibri" w:cs="Calibri" w:eastAsia="Calibri" w:hAnsi="Calibri"/>
-          <w:b w:val="0"/>
-          <w:i w:val="0"/>
-          <w:smallCaps w:val="0"/>
-          <w:strike w:val="0"/>
-          <w:color w:val="000000"/>
-          <w:sz w:val="24"/>
-          <w:szCs w:val="24"/>
-          <w:u w:val="none"/>
-          <w:shd w:fill="auto" w:val="clear"/>
-          <w:vertAlign w:val="baseline"/>
-          <w:rtl w:val="0"/>
-        </w:rPr>
-        <w:t xml:space="preserve"> VPN сервера, FTP сервера. Предотвращение DDoS, DoS, http-флуд атак по средствам IPTABLE, Nginx, CSF и др. </w:t>
+        <w:t xml:space="preserve">Предотвращение DDoS, DoS, http-флуд атак по средствам IPTABLE, Nginx, CSF и др. </w:t>
       </w:r>
     </w:p>
     <w:p>
@@ -1289,122 +1135,15 @@
           <w:vertAlign w:val="baseline"/>
           <w:rtl w:val="0"/>
         </w:rPr>
-        <w:t xml:space="preserve">Настройка DNS.</w:t>
-      </w:r>
-      <w:r>
-        <w:rPr>
-          <w:rtl w:val="0"/>
-        </w:rPr>
-      </w:r>
-    </w:p>
-    <w:p>
-      <w:pPr>
-        <w:keepNext w:val="0"/>
-        <w:keepLines w:val="0"/>
-        <w:pageBreakBefore w:val="0"/>
-        <w:widowControl w:val="1"/>
-        <w:numPr>
-          <w:ilvl w:val="0"/>
-          <w:numId w:val="1"/>
-        </w:numPr>
-        <w:pBdr>
-          <w:top w:space="0" w:sz="0" w:val="nil"/>
-          <w:left w:space="0" w:sz="0" w:val="nil"/>
-          <w:bottom w:space="0" w:sz="0" w:val="nil"/>
-          <w:right w:space="0" w:sz="0" w:val="nil"/>
-          <w:between w:space="0" w:sz="0" w:val="nil"/>
-        </w:pBdr>
-        <w:shd w:fill="auto" w:val="clear"/>
-        <w:spacing w:after="0" w:before="0" w:line="240" w:lineRule="auto"/>
-        <w:ind w:left="720" w:right="0" w:hanging="360"/>
-        <w:jc w:val="left"/>
-        <w:rPr>
-          <w:b w:val="0"/>
-          <w:i w:val="0"/>
-          <w:smallCaps w:val="0"/>
-          <w:strike w:val="0"/>
-          <w:color w:val="000000"/>
-          <w:sz w:val="24"/>
-          <w:szCs w:val="24"/>
-          <w:highlight w:val="white"/>
-          <w:u w:val="none"/>
-        </w:rPr>
-      </w:pPr>
-      <w:r>
-        <w:rPr>
-          <w:rFonts w:ascii="Calibri" w:cs="Calibri" w:eastAsia="Calibri" w:hAnsi="Calibri"/>
-          <w:b w:val="0"/>
-          <w:i w:val="0"/>
-          <w:smallCaps w:val="0"/>
-          <w:strike w:val="0"/>
-          <w:color w:val="000000"/>
-          <w:sz w:val="24"/>
-          <w:szCs w:val="24"/>
-          <w:u w:val="none"/>
-          <w:shd w:fill="auto" w:val="clear"/>
-          <w:vertAlign w:val="baseline"/>
-          <w:rtl w:val="0"/>
-        </w:rPr>
-        <w:t xml:space="preserve">Опыт работы с CDN</w:t>
-      </w:r>
-      <w:r>
-        <w:rPr>
-          <w:sz w:val="24"/>
-          <w:szCs w:val="24"/>
-          <w:rtl w:val="0"/>
-        </w:rPr>
-        <w:t xml:space="preserve">, AWS, Google Cloud Platform.</w:t>
-      </w:r>
-    </w:p>
-    <w:p>
-      <w:pPr>
-        <w:keepNext w:val="0"/>
-        <w:keepLines w:val="0"/>
-        <w:pageBreakBefore w:val="0"/>
-        <w:widowControl w:val="1"/>
-        <w:numPr>
-          <w:ilvl w:val="0"/>
-          <w:numId w:val="1"/>
-        </w:numPr>
-        <w:pBdr>
-          <w:top w:space="0" w:sz="0" w:val="nil"/>
-          <w:left w:space="0" w:sz="0" w:val="nil"/>
-          <w:bottom w:space="0" w:sz="0" w:val="nil"/>
-          <w:right w:space="0" w:sz="0" w:val="nil"/>
-          <w:between w:space="0" w:sz="0" w:val="nil"/>
-        </w:pBdr>
-        <w:shd w:fill="auto" w:val="clear"/>
-        <w:spacing w:after="0" w:before="0" w:line="240" w:lineRule="auto"/>
-        <w:ind w:left="720" w:right="0" w:hanging="360"/>
-        <w:jc w:val="left"/>
-        <w:rPr>
-          <w:b w:val="0"/>
-          <w:i w:val="0"/>
-          <w:smallCaps w:val="0"/>
-          <w:strike w:val="0"/>
-          <w:color w:val="000000"/>
-          <w:sz w:val="24"/>
-          <w:szCs w:val="24"/>
-          <w:highlight w:val="white"/>
-          <w:u w:val="none"/>
-        </w:rPr>
-      </w:pPr>
-      <w:r>
-        <w:rPr>
-          <w:rFonts w:ascii="Calibri" w:cs="Calibri" w:eastAsia="Calibri" w:hAnsi="Calibri"/>
-          <w:b w:val="0"/>
-          <w:i w:val="0"/>
-          <w:smallCaps w:val="0"/>
-          <w:strike w:val="0"/>
-          <w:color w:val="000000"/>
-          <w:sz w:val="24"/>
-          <w:szCs w:val="24"/>
-          <w:u w:val="none"/>
-          <w:shd w:fill="auto" w:val="clear"/>
-          <w:vertAlign w:val="baseline"/>
-          <w:rtl w:val="0"/>
-        </w:rPr>
-        <w:t xml:space="preserve">Подготовка и сохранение резервных копий данных, их периодическая проверка и уничтожение;</w:t>
+        <w:t xml:space="preserve">Опыт работы с </w:t>
+      </w:r>
+      <w:r>
+        <w:rPr>
+          <w:sz w:val="24"/>
+          <w:szCs w:val="24"/>
+          <w:rtl w:val="0"/>
+        </w:rPr>
+        <w:t xml:space="preserve">AWS, Google Cloud Platform.</w:t>
       </w:r>
       <w:r>
         <w:rPr>
@@ -1654,16 +1393,32 @@
         <w:rPr>
           <w:sz w:val="24"/>
           <w:szCs w:val="24"/>
-          <w:u w:val="none"/>
-        </w:rPr>
-      </w:pPr>
-      <w:r>
-        <w:rPr>
-          <w:sz w:val="24"/>
-          <w:szCs w:val="24"/>
-          <w:rtl w:val="0"/>
-        </w:rPr>
-        <w:t xml:space="preserve">Начальный опыт разработки телеграм ботов на python 3.</w:t>
+        </w:rPr>
+      </w:pPr>
+      <w:r>
+        <w:rPr>
+          <w:rFonts w:ascii="Calibri" w:cs="Calibri" w:eastAsia="Calibri" w:hAnsi="Calibri"/>
+          <w:b w:val="0"/>
+          <w:i w:val="0"/>
+          <w:smallCaps w:val="0"/>
+          <w:strike w:val="0"/>
+          <w:color w:val="000000"/>
+          <w:sz w:val="24"/>
+          <w:szCs w:val="24"/>
+          <w:u w:val="none"/>
+          <w:shd w:fill="auto" w:val="clear"/>
+          <w:vertAlign w:val="baseline"/>
+          <w:rtl w:val="0"/>
+        </w:rPr>
+        <w:t xml:space="preserve">Интеграция API модулей</w:t>
+      </w:r>
+      <w:r>
+        <w:rPr>
+          <w:sz w:val="24"/>
+          <w:szCs w:val="24"/>
+          <w:rtl w:val="0"/>
+        </w:rPr>
+        <w:t xml:space="preserve">.</w:t>
       </w:r>
       <w:r>
         <w:rPr>
@@ -1719,15 +1474,7 @@
           <w:vertAlign w:val="baseline"/>
           <w:rtl w:val="0"/>
         </w:rPr>
-        <w:t xml:space="preserve">Интеграция API модулей</w:t>
-      </w:r>
-      <w:r>
-        <w:rPr>
-          <w:sz w:val="24"/>
-          <w:szCs w:val="24"/>
-          <w:rtl w:val="0"/>
-        </w:rPr>
-        <w:t xml:space="preserve">.</w:t>
+        <w:t xml:space="preserve">Опыт работы с Google Analytics 4. Facebook Business manager.</w:t>
       </w:r>
       <w:r>
         <w:rPr>
@@ -1768,22 +1515,24 @@
           <w:u w:val="none"/>
         </w:rPr>
       </w:pPr>
-      <w:r>
-        <w:rPr>
-          <w:rFonts w:ascii="Calibri" w:cs="Calibri" w:eastAsia="Calibri" w:hAnsi="Calibri"/>
-          <w:b w:val="0"/>
-          <w:i w:val="0"/>
-          <w:smallCaps w:val="0"/>
-          <w:strike w:val="0"/>
-          <w:color w:val="000000"/>
-          <w:sz w:val="24"/>
-          <w:szCs w:val="24"/>
-          <w:u w:val="none"/>
-          <w:shd w:fill="auto" w:val="clear"/>
-          <w:vertAlign w:val="baseline"/>
-          <w:rtl w:val="0"/>
-        </w:rPr>
-        <w:t xml:space="preserve">Опыт работы с Google Analytics 4. Facebook Business manager.</w:t>
+      <w:bookmarkStart w:colFirst="0" w:colLast="0" w:name="_gjdgxs" w:id="0"/>
+      <w:bookmarkEnd w:id="0"/>
+      <w:r>
+        <w:rPr>
+          <w:rFonts w:ascii="Calibri" w:cs="Calibri" w:eastAsia="Calibri" w:hAnsi="Calibri"/>
+          <w:b w:val="0"/>
+          <w:i w:val="0"/>
+          <w:smallCaps w:val="0"/>
+          <w:strike w:val="0"/>
+          <w:color w:val="000000"/>
+          <w:sz w:val="24"/>
+          <w:szCs w:val="24"/>
+          <w:u w:val="none"/>
+          <w:shd w:fill="auto" w:val="clear"/>
+          <w:vertAlign w:val="baseline"/>
+          <w:rtl w:val="0"/>
+        </w:rPr>
+        <w:t xml:space="preserve">Умение работать с большим объемом информации.</w:t>
       </w:r>
       <w:r>
         <w:rPr>
@@ -1820,26 +1569,308 @@
           <w:color w:val="000000"/>
           <w:sz w:val="24"/>
           <w:szCs w:val="24"/>
-          <w:highlight w:val="white"/>
-          <w:u w:val="none"/>
-        </w:rPr>
-      </w:pPr>
-      <w:r>
-        <w:rPr>
-          <w:rFonts w:ascii="Calibri" w:cs="Calibri" w:eastAsia="Calibri" w:hAnsi="Calibri"/>
-          <w:b w:val="0"/>
-          <w:i w:val="0"/>
-          <w:smallCaps w:val="0"/>
-          <w:strike w:val="0"/>
-          <w:color w:val="000000"/>
-          <w:sz w:val="24"/>
-          <w:szCs w:val="24"/>
-          <w:highlight w:val="white"/>
-          <w:u w:val="none"/>
-          <w:vertAlign w:val="baseline"/>
-          <w:rtl w:val="0"/>
-        </w:rPr>
-        <w:t xml:space="preserve">Проектирование, внедрение и техническое сопровождение новых IT-решений.</w:t>
+          <w:u w:val="none"/>
+          <w:shd w:fill="auto" w:val="clear"/>
+        </w:rPr>
+      </w:pPr>
+      <w:bookmarkStart w:colFirst="0" w:colLast="0" w:name="_30j0zll" w:id="1"/>
+      <w:bookmarkEnd w:id="1"/>
+      <w:r>
+        <w:rPr>
+          <w:rFonts w:ascii="Calibri" w:cs="Calibri" w:eastAsia="Calibri" w:hAnsi="Calibri"/>
+          <w:b w:val="0"/>
+          <w:i w:val="0"/>
+          <w:smallCaps w:val="0"/>
+          <w:strike w:val="0"/>
+          <w:color w:val="000000"/>
+          <w:sz w:val="24"/>
+          <w:szCs w:val="24"/>
+          <w:u w:val="none"/>
+          <w:shd w:fill="auto" w:val="clear"/>
+          <w:vertAlign w:val="baseline"/>
+          <w:rtl w:val="0"/>
+        </w:rPr>
+        <w:t xml:space="preserve">Опыт управления персоналом до 10 человек.</w:t>
+      </w:r>
+    </w:p>
+    <w:p>
+      <w:pPr>
+        <w:keepNext w:val="0"/>
+        <w:keepLines w:val="0"/>
+        <w:pageBreakBefore w:val="0"/>
+        <w:widowControl w:val="1"/>
+        <w:pBdr>
+          <w:top w:space="0" w:sz="0" w:val="nil"/>
+          <w:left w:space="0" w:sz="0" w:val="nil"/>
+          <w:bottom w:space="0" w:sz="0" w:val="nil"/>
+          <w:right w:space="0" w:sz="0" w:val="nil"/>
+          <w:between w:space="0" w:sz="0" w:val="nil"/>
+        </w:pBdr>
+        <w:shd w:fill="auto" w:val="clear"/>
+        <w:spacing w:after="0" w:before="0" w:line="240" w:lineRule="auto"/>
+        <w:ind w:left="0" w:right="0" w:firstLine="0"/>
+        <w:jc w:val="left"/>
+        <w:rPr>
+          <w:rFonts w:ascii="Calibri" w:cs="Calibri" w:eastAsia="Calibri" w:hAnsi="Calibri"/>
+          <w:b w:val="0"/>
+          <w:i w:val="0"/>
+          <w:smallCaps w:val="0"/>
+          <w:strike w:val="0"/>
+          <w:color w:val="000000"/>
+          <w:sz w:val="24"/>
+          <w:szCs w:val="24"/>
+          <w:u w:val="none"/>
+          <w:shd w:fill="auto" w:val="clear"/>
+          <w:vertAlign w:val="baseline"/>
+        </w:rPr>
+      </w:pPr>
+      <w:r>
+        <w:rPr>
+          <w:rtl w:val="0"/>
+        </w:rPr>
+      </w:r>
+    </w:p>
+    <w:p>
+      <w:pPr>
+        <w:keepNext w:val="0"/>
+        <w:keepLines w:val="0"/>
+        <w:pageBreakBefore w:val="0"/>
+        <w:widowControl w:val="1"/>
+        <w:pBdr>
+          <w:top w:space="0" w:sz="0" w:val="nil"/>
+          <w:left w:space="0" w:sz="0" w:val="nil"/>
+          <w:bottom w:space="0" w:sz="0" w:val="nil"/>
+          <w:right w:space="0" w:sz="0" w:val="nil"/>
+          <w:between w:space="0" w:sz="0" w:val="nil"/>
+        </w:pBdr>
+        <w:shd w:fill="auto" w:val="clear"/>
+        <w:spacing w:after="0" w:before="0" w:line="240" w:lineRule="auto"/>
+        <w:ind w:left="0" w:right="0" w:firstLine="0"/>
+        <w:jc w:val="left"/>
+        <w:rPr>
+          <w:rFonts w:ascii="Calibri" w:cs="Calibri" w:eastAsia="Calibri" w:hAnsi="Calibri"/>
+          <w:b w:val="0"/>
+          <w:i w:val="0"/>
+          <w:smallCaps w:val="0"/>
+          <w:strike w:val="0"/>
+          <w:color w:val="000000"/>
+          <w:sz w:val="28"/>
+          <w:szCs w:val="28"/>
+          <w:u w:val="none"/>
+          <w:shd w:fill="auto" w:val="clear"/>
+          <w:vertAlign w:val="baseline"/>
+        </w:rPr>
+      </w:pPr>
+      <w:r>
+        <w:rPr>
+          <w:rFonts w:ascii="Calibri" w:cs="Calibri" w:eastAsia="Calibri" w:hAnsi="Calibri"/>
+          <w:b w:val="1"/>
+          <w:i w:val="0"/>
+          <w:smallCaps w:val="0"/>
+          <w:strike w:val="0"/>
+          <w:color w:val="000000"/>
+          <w:sz w:val="28"/>
+          <w:szCs w:val="28"/>
+          <w:u w:val="none"/>
+          <w:shd w:fill="auto" w:val="clear"/>
+          <w:vertAlign w:val="baseline"/>
+          <w:rtl w:val="0"/>
+        </w:rPr>
+        <w:t xml:space="preserve">Опыт работы:</w:t>
+      </w:r>
+      <w:r>
+        <w:rPr>
+          <w:rtl w:val="0"/>
+        </w:rPr>
+      </w:r>
+    </w:p>
+    <w:p>
+      <w:pPr>
+        <w:keepNext w:val="0"/>
+        <w:keepLines w:val="0"/>
+        <w:pageBreakBefore w:val="0"/>
+        <w:widowControl w:val="1"/>
+        <w:pBdr>
+          <w:top w:space="0" w:sz="0" w:val="nil"/>
+          <w:left w:space="0" w:sz="0" w:val="nil"/>
+          <w:bottom w:space="0" w:sz="0" w:val="nil"/>
+          <w:right w:space="0" w:sz="0" w:val="nil"/>
+          <w:between w:space="0" w:sz="0" w:val="nil"/>
+        </w:pBdr>
+        <w:shd w:fill="auto" w:val="clear"/>
+        <w:spacing w:after="0" w:before="0" w:line="240" w:lineRule="auto"/>
+        <w:ind w:left="0" w:right="0" w:firstLine="0"/>
+        <w:jc w:val="both"/>
+        <w:rPr>
+          <w:rFonts w:ascii="Calibri" w:cs="Calibri" w:eastAsia="Calibri" w:hAnsi="Calibri"/>
+          <w:b w:val="0"/>
+          <w:i w:val="0"/>
+          <w:smallCaps w:val="0"/>
+          <w:strike w:val="0"/>
+          <w:color w:val="000000"/>
+          <w:sz w:val="24"/>
+          <w:szCs w:val="24"/>
+          <w:u w:val="none"/>
+          <w:shd w:fill="auto" w:val="clear"/>
+          <w:vertAlign w:val="baseline"/>
+        </w:rPr>
+      </w:pPr>
+      <w:r>
+        <w:rPr>
+          <w:rFonts w:ascii="Calibri" w:cs="Calibri" w:eastAsia="Calibri" w:hAnsi="Calibri"/>
+          <w:b w:val="1"/>
+          <w:i w:val="0"/>
+          <w:smallCaps w:val="0"/>
+          <w:strike w:val="0"/>
+          <w:color w:val="000000"/>
+          <w:sz w:val="24"/>
+          <w:szCs w:val="24"/>
+          <w:u w:val="none"/>
+          <w:shd w:fill="auto" w:val="clear"/>
+          <w:vertAlign w:val="baseline"/>
+          <w:rtl w:val="0"/>
+        </w:rPr>
+        <w:t xml:space="preserve">2008 – 2010.</w:t>
+      </w:r>
+      <w:r>
+        <w:rPr>
+          <w:rFonts w:ascii="Calibri" w:cs="Calibri" w:eastAsia="Calibri" w:hAnsi="Calibri"/>
+          <w:b w:val="0"/>
+          <w:i w:val="0"/>
+          <w:smallCaps w:val="0"/>
+          <w:strike w:val="0"/>
+          <w:color w:val="000000"/>
+          <w:sz w:val="24"/>
+          <w:szCs w:val="24"/>
+          <w:u w:val="none"/>
+          <w:shd w:fill="auto" w:val="clear"/>
+          <w:vertAlign w:val="baseline"/>
+          <w:rtl w:val="0"/>
+        </w:rPr>
+        <w:t xml:space="preserve"> Монтажник слаботочных сетей</w:t>
+      </w:r>
+    </w:p>
+    <w:p>
+      <w:pPr>
+        <w:keepNext w:val="0"/>
+        <w:keepLines w:val="0"/>
+        <w:pageBreakBefore w:val="0"/>
+        <w:widowControl w:val="1"/>
+        <w:pBdr>
+          <w:top w:space="0" w:sz="0" w:val="nil"/>
+          <w:left w:space="0" w:sz="0" w:val="nil"/>
+          <w:bottom w:space="0" w:sz="0" w:val="nil"/>
+          <w:right w:space="0" w:sz="0" w:val="nil"/>
+          <w:between w:space="0" w:sz="0" w:val="nil"/>
+        </w:pBdr>
+        <w:shd w:fill="auto" w:val="clear"/>
+        <w:spacing w:after="0" w:before="0" w:line="240" w:lineRule="auto"/>
+        <w:ind w:left="0" w:right="0" w:firstLine="0"/>
+        <w:jc w:val="both"/>
+        <w:rPr>
+          <w:rFonts w:ascii="Calibri" w:cs="Calibri" w:eastAsia="Calibri" w:hAnsi="Calibri"/>
+          <w:b w:val="0"/>
+          <w:i w:val="0"/>
+          <w:smallCaps w:val="0"/>
+          <w:strike w:val="0"/>
+          <w:color w:val="000000"/>
+          <w:sz w:val="24"/>
+          <w:szCs w:val="24"/>
+          <w:u w:val="none"/>
+          <w:shd w:fill="auto" w:val="clear"/>
+          <w:vertAlign w:val="baseline"/>
+        </w:rPr>
+      </w:pPr>
+      <w:r>
+        <w:rPr>
+          <w:rFonts w:ascii="Calibri" w:cs="Calibri" w:eastAsia="Calibri" w:hAnsi="Calibri"/>
+          <w:b w:val="0"/>
+          <w:i w:val="0"/>
+          <w:smallCaps w:val="0"/>
+          <w:strike w:val="0"/>
+          <w:color w:val="000000"/>
+          <w:sz w:val="24"/>
+          <w:szCs w:val="24"/>
+          <w:u w:val="none"/>
+          <w:shd w:fill="auto" w:val="clear"/>
+          <w:vertAlign w:val="baseline"/>
+          <w:rtl w:val="0"/>
+        </w:rPr>
+        <w:t xml:space="preserve">ЧП Конкорд, г. Дн</w:t>
+      </w:r>
+      <w:r>
+        <w:rPr>
+          <w:sz w:val="24"/>
+          <w:szCs w:val="24"/>
+          <w:rtl w:val="0"/>
+        </w:rPr>
+        <w:t xml:space="preserve">е</w:t>
+      </w:r>
+      <w:r>
+        <w:rPr>
+          <w:rFonts w:ascii="Calibri" w:cs="Calibri" w:eastAsia="Calibri" w:hAnsi="Calibri"/>
+          <w:b w:val="0"/>
+          <w:i w:val="0"/>
+          <w:smallCaps w:val="0"/>
+          <w:strike w:val="0"/>
+          <w:color w:val="000000"/>
+          <w:sz w:val="24"/>
+          <w:szCs w:val="24"/>
+          <w:u w:val="none"/>
+          <w:shd w:fill="auto" w:val="clear"/>
+          <w:vertAlign w:val="baseline"/>
+          <w:rtl w:val="0"/>
+        </w:rPr>
+        <w:t xml:space="preserve">пр</w:t>
+      </w:r>
+    </w:p>
+    <w:p>
+      <w:pPr>
+        <w:keepNext w:val="0"/>
+        <w:keepLines w:val="0"/>
+        <w:pageBreakBefore w:val="0"/>
+        <w:widowControl w:val="1"/>
+        <w:pBdr>
+          <w:top w:space="0" w:sz="0" w:val="nil"/>
+          <w:left w:space="0" w:sz="0" w:val="nil"/>
+          <w:bottom w:space="0" w:sz="0" w:val="nil"/>
+          <w:right w:space="0" w:sz="0" w:val="nil"/>
+          <w:between w:space="0" w:sz="0" w:val="nil"/>
+        </w:pBdr>
+        <w:shd w:fill="auto" w:val="clear"/>
+        <w:spacing w:after="0" w:before="0" w:line="240" w:lineRule="auto"/>
+        <w:ind w:left="0" w:right="0" w:firstLine="0"/>
+        <w:jc w:val="left"/>
+        <w:rPr>
+          <w:rFonts w:ascii="Calibri" w:cs="Calibri" w:eastAsia="Calibri" w:hAnsi="Calibri"/>
+          <w:b w:val="0"/>
+          <w:i w:val="0"/>
+          <w:smallCaps w:val="0"/>
+          <w:strike w:val="0"/>
+          <w:color w:val="000000"/>
+          <w:sz w:val="24"/>
+          <w:szCs w:val="24"/>
+          <w:u w:val="none"/>
+          <w:shd w:fill="auto" w:val="clear"/>
+          <w:vertAlign w:val="baseline"/>
+        </w:rPr>
+      </w:pPr>
+      <w:r>
+        <w:rPr>
+          <w:rFonts w:ascii="Calibri" w:cs="Calibri" w:eastAsia="Calibri" w:hAnsi="Calibri"/>
+          <w:b w:val="0"/>
+          <w:i w:val="0"/>
+          <w:smallCaps w:val="0"/>
+          <w:strike w:val="0"/>
+          <w:color w:val="000000"/>
+          <w:sz w:val="24"/>
+          <w:szCs w:val="24"/>
+          <w:u w:val="none"/>
+          <w:shd w:fill="auto" w:val="clear"/>
+          <w:vertAlign w:val="baseline"/>
+          <w:rtl w:val="0"/>
+        </w:rPr>
+        <w:t xml:space="preserve">Сфера деятельности компании: установка и обслуживание систем безопасности и видеонаблюдения.</w:t>
       </w:r>
     </w:p>
     <w:p>
@@ -1875,29 +1906,31 @@
           <w:u w:val="none"/>
         </w:rPr>
       </w:pPr>
-      <w:bookmarkStart w:colFirst="0" w:colLast="0" w:name="_gjdgxs" w:id="0"/>
-      <w:bookmarkEnd w:id="0"/>
-      <w:r>
-        <w:rPr>
-          <w:rFonts w:ascii="Calibri" w:cs="Calibri" w:eastAsia="Calibri" w:hAnsi="Calibri"/>
-          <w:b w:val="0"/>
-          <w:i w:val="0"/>
-          <w:smallCaps w:val="0"/>
-          <w:strike w:val="0"/>
-          <w:color w:val="000000"/>
-          <w:sz w:val="24"/>
-          <w:szCs w:val="24"/>
-          <w:u w:val="none"/>
-          <w:shd w:fill="auto" w:val="clear"/>
-          <w:vertAlign w:val="baseline"/>
-          <w:rtl w:val="0"/>
-        </w:rPr>
-        <w:t xml:space="preserve">Умение работать с большим объемом информации.</w:t>
-      </w:r>
-      <w:r>
-        <w:rPr>
-          <w:rtl w:val="0"/>
-        </w:rPr>
+      <w:r>
+        <w:rPr>
+          <w:sz w:val="24"/>
+          <w:szCs w:val="24"/>
+          <w:highlight w:val="white"/>
+          <w:rtl w:val="0"/>
+        </w:rPr>
+        <w:t xml:space="preserve">Проектирование</w:t>
+      </w:r>
+      <w:r>
+        <w:rPr>
+          <w:rFonts w:ascii="Calibri" w:cs="Calibri" w:eastAsia="Calibri" w:hAnsi="Calibri"/>
+          <w:b w:val="0"/>
+          <w:i w:val="0"/>
+          <w:smallCaps w:val="0"/>
+          <w:strike w:val="0"/>
+          <w:color w:val="000000"/>
+          <w:sz w:val="24"/>
+          <w:szCs w:val="24"/>
+          <w:highlight w:val="white"/>
+          <w:u w:val="none"/>
+          <w:vertAlign w:val="baseline"/>
+          <w:rtl w:val="0"/>
+        </w:rPr>
+        <w:t xml:space="preserve"> схем расположения оборудования для безопасности.</w:t>
       </w:r>
     </w:p>
     <w:p>
@@ -1929,131 +1962,26 @@
           <w:color w:val="000000"/>
           <w:sz w:val="24"/>
           <w:szCs w:val="24"/>
-          <w:u w:val="none"/>
-          <w:shd w:fill="auto" w:val="clear"/>
-        </w:rPr>
-      </w:pPr>
-      <w:bookmarkStart w:colFirst="0" w:colLast="0" w:name="_30j0zll" w:id="1"/>
-      <w:bookmarkEnd w:id="1"/>
-      <w:r>
-        <w:rPr>
-          <w:rFonts w:ascii="Calibri" w:cs="Calibri" w:eastAsia="Calibri" w:hAnsi="Calibri"/>
-          <w:b w:val="0"/>
-          <w:i w:val="0"/>
-          <w:smallCaps w:val="0"/>
-          <w:strike w:val="0"/>
-          <w:color w:val="000000"/>
-          <w:sz w:val="24"/>
-          <w:szCs w:val="24"/>
-          <w:u w:val="none"/>
-          <w:shd w:fill="auto" w:val="clear"/>
-          <w:vertAlign w:val="baseline"/>
-          <w:rtl w:val="0"/>
-        </w:rPr>
-        <w:t xml:space="preserve">Опыт управления персоналом до 10 человек.</w:t>
-      </w:r>
-    </w:p>
-    <w:p>
-      <w:pPr>
-        <w:keepNext w:val="0"/>
-        <w:keepLines w:val="0"/>
-        <w:pageBreakBefore w:val="0"/>
-        <w:widowControl w:val="1"/>
-        <w:pBdr>
-          <w:top w:space="0" w:sz="0" w:val="nil"/>
-          <w:left w:space="0" w:sz="0" w:val="nil"/>
-          <w:bottom w:space="0" w:sz="0" w:val="nil"/>
-          <w:right w:space="0" w:sz="0" w:val="nil"/>
-          <w:between w:space="0" w:sz="0" w:val="nil"/>
-        </w:pBdr>
-        <w:shd w:fill="auto" w:val="clear"/>
-        <w:spacing w:after="0" w:before="0" w:line="264" w:lineRule="auto"/>
-        <w:ind w:left="0" w:right="0" w:firstLine="0"/>
-        <w:jc w:val="left"/>
-        <w:rPr>
-          <w:rFonts w:ascii="Calibri" w:cs="Calibri" w:eastAsia="Calibri" w:hAnsi="Calibri"/>
-          <w:b w:val="0"/>
-          <w:i w:val="0"/>
-          <w:smallCaps w:val="0"/>
-          <w:strike w:val="0"/>
-          <w:color w:val="000000"/>
-          <w:sz w:val="24"/>
-          <w:szCs w:val="24"/>
-          <w:u w:val="none"/>
-          <w:shd w:fill="auto" w:val="clear"/>
-          <w:vertAlign w:val="baseline"/>
-        </w:rPr>
-      </w:pPr>
-      <w:r>
-        <w:rPr>
-          <w:rtl w:val="0"/>
-        </w:rPr>
-      </w:r>
-    </w:p>
-    <w:p>
-      <w:pPr>
-        <w:keepNext w:val="0"/>
-        <w:keepLines w:val="0"/>
-        <w:pageBreakBefore w:val="0"/>
-        <w:widowControl w:val="1"/>
-        <w:pBdr>
-          <w:top w:space="0" w:sz="0" w:val="nil"/>
-          <w:left w:space="0" w:sz="0" w:val="nil"/>
-          <w:bottom w:space="0" w:sz="0" w:val="nil"/>
-          <w:right w:space="0" w:sz="0" w:val="nil"/>
-          <w:between w:space="0" w:sz="0" w:val="nil"/>
-        </w:pBdr>
-        <w:shd w:fill="auto" w:val="clear"/>
-        <w:spacing w:after="0" w:before="0" w:line="240" w:lineRule="auto"/>
-        <w:ind w:left="0" w:right="0" w:firstLine="0"/>
-        <w:jc w:val="left"/>
-        <w:rPr>
-          <w:rFonts w:ascii="Calibri" w:cs="Calibri" w:eastAsia="Calibri" w:hAnsi="Calibri"/>
-          <w:b w:val="0"/>
-          <w:i w:val="0"/>
-          <w:smallCaps w:val="0"/>
-          <w:strike w:val="0"/>
-          <w:color w:val="000000"/>
-          <w:sz w:val="24"/>
-          <w:szCs w:val="24"/>
-          <w:u w:val="none"/>
-          <w:shd w:fill="auto" w:val="clear"/>
-          <w:vertAlign w:val="baseline"/>
-        </w:rPr>
-      </w:pPr>
-      <w:r>
-        <w:rPr>
-          <w:rFonts w:ascii="Calibri" w:cs="Calibri" w:eastAsia="Calibri" w:hAnsi="Calibri"/>
-          <w:b w:val="1"/>
-          <w:i w:val="0"/>
-          <w:smallCaps w:val="0"/>
-          <w:strike w:val="0"/>
-          <w:color w:val="000000"/>
-          <w:sz w:val="24"/>
-          <w:szCs w:val="24"/>
-          <w:u w:val="none"/>
-          <w:shd w:fill="auto" w:val="clear"/>
-          <w:vertAlign w:val="baseline"/>
-          <w:rtl w:val="0"/>
-        </w:rPr>
-        <w:t xml:space="preserve">Достижения:</w:t>
-      </w:r>
-      <w:r>
-        <w:rPr>
-          <w:rFonts w:ascii="Calibri" w:cs="Calibri" w:eastAsia="Calibri" w:hAnsi="Calibri"/>
-          <w:b w:val="0"/>
-          <w:i w:val="0"/>
-          <w:smallCaps w:val="0"/>
-          <w:strike w:val="0"/>
-          <w:color w:val="000000"/>
-          <w:sz w:val="24"/>
-          <w:szCs w:val="24"/>
-          <w:u w:val="none"/>
-          <w:shd w:fill="auto" w:val="clear"/>
-          <w:vertAlign w:val="baseline"/>
-          <w:rtl w:val="0"/>
-        </w:rPr>
-        <w:t xml:space="preserve"> </w:t>
+          <w:highlight w:val="white"/>
+          <w:u w:val="none"/>
+        </w:rPr>
+      </w:pPr>
+      <w:r>
+        <w:rPr>
+          <w:rFonts w:ascii="Calibri" w:cs="Calibri" w:eastAsia="Calibri" w:hAnsi="Calibri"/>
+          <w:b w:val="0"/>
+          <w:i w:val="0"/>
+          <w:smallCaps w:val="0"/>
+          <w:strike w:val="0"/>
+          <w:color w:val="000000"/>
+          <w:sz w:val="24"/>
+          <w:szCs w:val="24"/>
+          <w:highlight w:val="white"/>
+          <w:u w:val="none"/>
+          <w:vertAlign w:val="baseline"/>
+          <w:rtl w:val="0"/>
+        </w:rPr>
+        <w:t xml:space="preserve">Установка оборудования.</w:t>
       </w:r>
     </w:p>
     <w:p>
@@ -2085,51 +2013,26 @@
           <w:color w:val="000000"/>
           <w:sz w:val="24"/>
           <w:szCs w:val="24"/>
-          <w:u w:val="none"/>
-          <w:shd w:fill="auto" w:val="clear"/>
-        </w:rPr>
-      </w:pPr>
-      <w:r>
-        <w:rPr>
-          <w:rFonts w:ascii="Calibri" w:cs="Calibri" w:eastAsia="Calibri" w:hAnsi="Calibri"/>
-          <w:b w:val="0"/>
-          <w:i w:val="0"/>
-          <w:smallCaps w:val="0"/>
-          <w:strike w:val="0"/>
-          <w:color w:val="000000"/>
-          <w:sz w:val="24"/>
-          <w:szCs w:val="24"/>
-          <w:u w:val="none"/>
-          <w:shd w:fill="auto" w:val="clear"/>
-          <w:vertAlign w:val="baseline"/>
-          <w:rtl w:val="0"/>
-        </w:rPr>
-        <w:t xml:space="preserve">Разработал и внедрил стратегии информационной безопасности в ЧП Azbuka.Ex, что впоследствии позволило избежать потери больших массивов информации и способствовало стабильной работе большого количества веб-сайтов и веб приложений </w:t>
-      </w:r>
-      <w:r>
-        <w:rPr>
-          <w:sz w:val="24"/>
-          <w:szCs w:val="24"/>
-          <w:rtl w:val="0"/>
-        </w:rPr>
-        <w:t xml:space="preserve">на серверах</w:t>
-      </w:r>
-      <w:r>
-        <w:rPr>
-          <w:rFonts w:ascii="Calibri" w:cs="Calibri" w:eastAsia="Calibri" w:hAnsi="Calibri"/>
-          <w:b w:val="0"/>
-          <w:i w:val="0"/>
-          <w:smallCaps w:val="0"/>
-          <w:strike w:val="0"/>
-          <w:color w:val="000000"/>
-          <w:sz w:val="24"/>
-          <w:szCs w:val="24"/>
-          <w:u w:val="none"/>
-          <w:shd w:fill="auto" w:val="clear"/>
-          <w:vertAlign w:val="baseline"/>
-          <w:rtl w:val="0"/>
-        </w:rPr>
-        <w:t xml:space="preserve">. </w:t>
+          <w:highlight w:val="white"/>
+          <w:u w:val="none"/>
+        </w:rPr>
+      </w:pPr>
+      <w:r>
+        <w:rPr>
+          <w:rFonts w:ascii="Calibri" w:cs="Calibri" w:eastAsia="Calibri" w:hAnsi="Calibri"/>
+          <w:b w:val="0"/>
+          <w:i w:val="0"/>
+          <w:smallCaps w:val="0"/>
+          <w:strike w:val="0"/>
+          <w:color w:val="000000"/>
+          <w:sz w:val="24"/>
+          <w:szCs w:val="24"/>
+          <w:highlight w:val="white"/>
+          <w:u w:val="none"/>
+          <w:vertAlign w:val="baseline"/>
+          <w:rtl w:val="0"/>
+        </w:rPr>
+        <w:t xml:space="preserve">Администрирование и программирование модулей управления.</w:t>
       </w:r>
     </w:p>
     <w:p>
@@ -2161,35 +2064,187 @@
           <w:color w:val="000000"/>
           <w:sz w:val="24"/>
           <w:szCs w:val="24"/>
-          <w:u w:val="none"/>
-          <w:shd w:fill="auto" w:val="clear"/>
-        </w:rPr>
-      </w:pPr>
-      <w:r>
-        <w:rPr>
-          <w:rFonts w:ascii="Calibri" w:cs="Calibri" w:eastAsia="Calibri" w:hAnsi="Calibri"/>
-          <w:b w:val="0"/>
-          <w:i w:val="0"/>
-          <w:smallCaps w:val="0"/>
-          <w:strike w:val="0"/>
-          <w:color w:val="000000"/>
-          <w:sz w:val="24"/>
-          <w:szCs w:val="24"/>
-          <w:u w:val="none"/>
-          <w:shd w:fill="auto" w:val="clear"/>
-          <w:vertAlign w:val="baseline"/>
-          <w:rtl w:val="0"/>
-        </w:rPr>
-        <w:t xml:space="preserve">Устранение неполадок в компьютерной системе, серверах. </w:t>
-      </w:r>
-      <w:r>
-        <w:rPr>
-          <w:sz w:val="24"/>
-          <w:szCs w:val="24"/>
-          <w:rtl w:val="0"/>
-        </w:rPr>
-        <w:t xml:space="preserve">Автоматизация работы.</w:t>
-      </w:r>
+          <w:highlight w:val="white"/>
+          <w:u w:val="none"/>
+        </w:rPr>
+      </w:pPr>
+      <w:r>
+        <w:rPr>
+          <w:rFonts w:ascii="Calibri" w:cs="Calibri" w:eastAsia="Calibri" w:hAnsi="Calibri"/>
+          <w:b w:val="0"/>
+          <w:i w:val="0"/>
+          <w:smallCaps w:val="0"/>
+          <w:strike w:val="0"/>
+          <w:color w:val="000000"/>
+          <w:sz w:val="24"/>
+          <w:szCs w:val="24"/>
+          <w:highlight w:val="white"/>
+          <w:u w:val="none"/>
+          <w:vertAlign w:val="baseline"/>
+          <w:rtl w:val="0"/>
+        </w:rPr>
+        <w:t xml:space="preserve">Администрирование серверов.</w:t>
+      </w:r>
+    </w:p>
+    <w:p>
+      <w:pPr>
+        <w:keepNext w:val="0"/>
+        <w:keepLines w:val="0"/>
+        <w:pageBreakBefore w:val="0"/>
+        <w:widowControl w:val="1"/>
+        <w:pBdr>
+          <w:top w:space="0" w:sz="0" w:val="nil"/>
+          <w:left w:space="0" w:sz="0" w:val="nil"/>
+          <w:bottom w:space="0" w:sz="0" w:val="nil"/>
+          <w:right w:space="0" w:sz="0" w:val="nil"/>
+          <w:between w:space="0" w:sz="0" w:val="nil"/>
+        </w:pBdr>
+        <w:shd w:fill="auto" w:val="clear"/>
+        <w:spacing w:after="0" w:before="0" w:line="240" w:lineRule="auto"/>
+        <w:ind w:left="0" w:right="0" w:firstLine="0"/>
+        <w:jc w:val="both"/>
+        <w:rPr>
+          <w:rFonts w:ascii="Calibri" w:cs="Calibri" w:eastAsia="Calibri" w:hAnsi="Calibri"/>
+          <w:b w:val="0"/>
+          <w:i w:val="0"/>
+          <w:smallCaps w:val="0"/>
+          <w:strike w:val="0"/>
+          <w:color w:val="000000"/>
+          <w:sz w:val="24"/>
+          <w:szCs w:val="24"/>
+          <w:u w:val="none"/>
+          <w:shd w:fill="auto" w:val="clear"/>
+          <w:vertAlign w:val="baseline"/>
+        </w:rPr>
+      </w:pPr>
+      <w:r>
+        <w:rPr>
+          <w:rFonts w:ascii="Calibri" w:cs="Calibri" w:eastAsia="Calibri" w:hAnsi="Calibri"/>
+          <w:b w:val="1"/>
+          <w:i w:val="0"/>
+          <w:smallCaps w:val="0"/>
+          <w:strike w:val="0"/>
+          <w:color w:val="000000"/>
+          <w:sz w:val="24"/>
+          <w:szCs w:val="24"/>
+          <w:u w:val="none"/>
+          <w:shd w:fill="auto" w:val="clear"/>
+          <w:vertAlign w:val="baseline"/>
+          <w:rtl w:val="0"/>
+        </w:rPr>
+        <w:t xml:space="preserve">2010 – 2014</w:t>
+      </w:r>
+      <w:r>
+        <w:rPr>
+          <w:rFonts w:ascii="Calibri" w:cs="Calibri" w:eastAsia="Calibri" w:hAnsi="Calibri"/>
+          <w:b w:val="0"/>
+          <w:i w:val="0"/>
+          <w:smallCaps w:val="0"/>
+          <w:strike w:val="0"/>
+          <w:color w:val="000000"/>
+          <w:sz w:val="24"/>
+          <w:szCs w:val="24"/>
+          <w:u w:val="none"/>
+          <w:shd w:fill="auto" w:val="clear"/>
+          <w:vertAlign w:val="baseline"/>
+          <w:rtl w:val="0"/>
+        </w:rPr>
+        <w:t xml:space="preserve"> Системный администратор</w:t>
+      </w:r>
+    </w:p>
+    <w:p>
+      <w:pPr>
+        <w:keepNext w:val="0"/>
+        <w:keepLines w:val="0"/>
+        <w:pageBreakBefore w:val="0"/>
+        <w:widowControl w:val="1"/>
+        <w:pBdr>
+          <w:top w:space="0" w:sz="0" w:val="nil"/>
+          <w:left w:space="0" w:sz="0" w:val="nil"/>
+          <w:bottom w:space="0" w:sz="0" w:val="nil"/>
+          <w:right w:space="0" w:sz="0" w:val="nil"/>
+          <w:between w:space="0" w:sz="0" w:val="nil"/>
+        </w:pBdr>
+        <w:shd w:fill="auto" w:val="clear"/>
+        <w:spacing w:after="0" w:before="0" w:line="240" w:lineRule="auto"/>
+        <w:ind w:left="0" w:right="0" w:firstLine="0"/>
+        <w:jc w:val="both"/>
+        <w:rPr>
+          <w:rFonts w:ascii="Calibri" w:cs="Calibri" w:eastAsia="Calibri" w:hAnsi="Calibri"/>
+          <w:b w:val="0"/>
+          <w:i w:val="0"/>
+          <w:smallCaps w:val="0"/>
+          <w:strike w:val="0"/>
+          <w:color w:val="000000"/>
+          <w:sz w:val="24"/>
+          <w:szCs w:val="24"/>
+          <w:u w:val="none"/>
+          <w:shd w:fill="auto" w:val="clear"/>
+          <w:vertAlign w:val="baseline"/>
+        </w:rPr>
+      </w:pPr>
+      <w:r>
+        <w:rPr>
+          <w:rFonts w:ascii="Calibri" w:cs="Calibri" w:eastAsia="Calibri" w:hAnsi="Calibri"/>
+          <w:b w:val="0"/>
+          <w:i w:val="0"/>
+          <w:smallCaps w:val="0"/>
+          <w:strike w:val="0"/>
+          <w:color w:val="000000"/>
+          <w:sz w:val="24"/>
+          <w:szCs w:val="24"/>
+          <w:u w:val="none"/>
+          <w:shd w:fill="auto" w:val="clear"/>
+          <w:vertAlign w:val="baseline"/>
+          <w:rtl w:val="0"/>
+        </w:rPr>
+        <w:t xml:space="preserve">GreenSolution, г. </w:t>
+      </w:r>
+      <w:r>
+        <w:rPr>
+          <w:sz w:val="24"/>
+          <w:szCs w:val="24"/>
+          <w:rtl w:val="0"/>
+        </w:rPr>
+        <w:t xml:space="preserve">Днепр</w:t>
+      </w:r>
+      <w:r>
+        <w:rPr>
+          <w:rtl w:val="0"/>
+        </w:rPr>
+      </w:r>
+    </w:p>
+    <w:p>
+      <w:pPr>
+        <w:keepNext w:val="0"/>
+        <w:keepLines w:val="0"/>
+        <w:pageBreakBefore w:val="0"/>
+        <w:widowControl w:val="1"/>
+        <w:pBdr>
+          <w:top w:space="0" w:sz="0" w:val="nil"/>
+          <w:left w:space="0" w:sz="0" w:val="nil"/>
+          <w:bottom w:space="0" w:sz="0" w:val="nil"/>
+          <w:right w:space="0" w:sz="0" w:val="nil"/>
+          <w:between w:space="0" w:sz="0" w:val="nil"/>
+        </w:pBdr>
+        <w:shd w:fill="auto" w:val="clear"/>
+        <w:spacing w:after="0" w:before="0" w:line="240" w:lineRule="auto"/>
+        <w:ind w:left="0" w:right="0" w:firstLine="0"/>
+        <w:jc w:val="left"/>
+        <w:rPr>
+          <w:rFonts w:ascii="Calibri" w:cs="Calibri" w:eastAsia="Calibri" w:hAnsi="Calibri"/>
+          <w:b w:val="0"/>
+          <w:i w:val="0"/>
+          <w:smallCaps w:val="0"/>
+          <w:strike w:val="0"/>
+          <w:color w:val="000000"/>
+          <w:sz w:val="24"/>
+          <w:szCs w:val="24"/>
+          <w:u w:val="none"/>
+          <w:shd w:fill="auto" w:val="clear"/>
+          <w:vertAlign w:val="baseline"/>
+        </w:rPr>
+      </w:pPr>
       <w:r>
         <w:rPr>
           <w:rtl w:val="0"/>
@@ -2214,7 +2269,7 @@
           <w:between w:space="0" w:sz="0" w:val="nil"/>
         </w:pBdr>
         <w:shd w:fill="auto" w:val="clear"/>
-        <w:spacing w:after="0" w:before="0" w:line="240" w:lineRule="auto"/>
+        <w:spacing w:after="0" w:before="280" w:line="240" w:lineRule="auto"/>
         <w:ind w:left="720" w:right="0" w:hanging="360"/>
         <w:jc w:val="left"/>
         <w:rPr>
@@ -2244,7 +2299,7 @@
           <w:vertAlign w:val="baseline"/>
           <w:rtl w:val="0"/>
         </w:rPr>
-        <w:t xml:space="preserve">Монтаж компьютерной техники и определения необходимости ремонта;</w:t>
+        <w:t xml:space="preserve">Администрирование локальных сетей, серверов, рабочих станций.</w:t>
       </w:r>
     </w:p>
     <w:p>
@@ -2295,287 +2350,7 @@
           <w:vertAlign w:val="baseline"/>
           <w:rtl w:val="0"/>
         </w:rPr>
-        <w:t xml:space="preserve">Участие в разработке веб сайтов, порталов и веб приложений. Создание платформы для анализа рынка, и работы с блокчейн системами.</w:t>
-      </w:r>
-    </w:p>
-    <w:p>
-      <w:pPr>
-        <w:keepNext w:val="0"/>
-        <w:keepLines w:val="0"/>
-        <w:pageBreakBefore w:val="0"/>
-        <w:widowControl w:val="1"/>
-        <w:pBdr>
-          <w:top w:space="0" w:sz="0" w:val="nil"/>
-          <w:left w:space="0" w:sz="0" w:val="nil"/>
-          <w:bottom w:space="0" w:sz="0" w:val="nil"/>
-          <w:right w:space="0" w:sz="0" w:val="nil"/>
-          <w:between w:space="0" w:sz="0" w:val="nil"/>
-        </w:pBdr>
-        <w:shd w:fill="auto" w:val="clear"/>
-        <w:spacing w:after="0" w:before="0" w:line="240" w:lineRule="auto"/>
-        <w:ind w:left="0" w:right="0" w:firstLine="0"/>
-        <w:jc w:val="left"/>
-        <w:rPr>
-          <w:rFonts w:ascii="Calibri" w:cs="Calibri" w:eastAsia="Calibri" w:hAnsi="Calibri"/>
-          <w:b w:val="0"/>
-          <w:i w:val="0"/>
-          <w:smallCaps w:val="0"/>
-          <w:strike w:val="0"/>
-          <w:color w:val="000000"/>
-          <w:sz w:val="24"/>
-          <w:szCs w:val="24"/>
-          <w:u w:val="none"/>
-          <w:shd w:fill="auto" w:val="clear"/>
-          <w:vertAlign w:val="baseline"/>
-        </w:rPr>
-      </w:pPr>
-      <w:r>
-        <w:rPr>
-          <w:rtl w:val="0"/>
-        </w:rPr>
-      </w:r>
-    </w:p>
-    <w:p>
-      <w:pPr>
-        <w:keepNext w:val="0"/>
-        <w:keepLines w:val="0"/>
-        <w:pageBreakBefore w:val="0"/>
-        <w:widowControl w:val="1"/>
-        <w:pBdr>
-          <w:top w:space="0" w:sz="0" w:val="nil"/>
-          <w:left w:space="0" w:sz="0" w:val="nil"/>
-          <w:bottom w:space="0" w:sz="0" w:val="nil"/>
-          <w:right w:space="0" w:sz="0" w:val="nil"/>
-          <w:between w:space="0" w:sz="0" w:val="nil"/>
-        </w:pBdr>
-        <w:shd w:fill="auto" w:val="clear"/>
-        <w:spacing w:after="0" w:before="0" w:line="240" w:lineRule="auto"/>
-        <w:ind w:left="0" w:right="0" w:firstLine="0"/>
-        <w:jc w:val="left"/>
-        <w:rPr>
-          <w:rFonts w:ascii="Calibri" w:cs="Calibri" w:eastAsia="Calibri" w:hAnsi="Calibri"/>
-          <w:b w:val="0"/>
-          <w:i w:val="0"/>
-          <w:smallCaps w:val="0"/>
-          <w:strike w:val="0"/>
-          <w:color w:val="000000"/>
-          <w:sz w:val="24"/>
-          <w:szCs w:val="24"/>
-          <w:u w:val="none"/>
-          <w:shd w:fill="auto" w:val="clear"/>
-          <w:vertAlign w:val="baseline"/>
-        </w:rPr>
-      </w:pPr>
-      <w:r>
-        <w:rPr>
-          <w:rFonts w:ascii="Calibri" w:cs="Calibri" w:eastAsia="Calibri" w:hAnsi="Calibri"/>
-          <w:b w:val="1"/>
-          <w:i w:val="0"/>
-          <w:smallCaps w:val="0"/>
-          <w:strike w:val="0"/>
-          <w:color w:val="000000"/>
-          <w:sz w:val="24"/>
-          <w:szCs w:val="24"/>
-          <w:u w:val="none"/>
-          <w:shd w:fill="auto" w:val="clear"/>
-          <w:vertAlign w:val="baseline"/>
-          <w:rtl w:val="0"/>
-        </w:rPr>
-        <w:t xml:space="preserve">Опыт работы:</w:t>
-      </w:r>
-      <w:r>
-        <w:rPr>
-          <w:rtl w:val="0"/>
-        </w:rPr>
-      </w:r>
-    </w:p>
-    <w:p>
-      <w:pPr>
-        <w:keepNext w:val="0"/>
-        <w:keepLines w:val="0"/>
-        <w:pageBreakBefore w:val="0"/>
-        <w:widowControl w:val="1"/>
-        <w:pBdr>
-          <w:top w:space="0" w:sz="0" w:val="nil"/>
-          <w:left w:space="0" w:sz="0" w:val="nil"/>
-          <w:bottom w:space="0" w:sz="0" w:val="nil"/>
-          <w:right w:space="0" w:sz="0" w:val="nil"/>
-          <w:between w:space="0" w:sz="0" w:val="nil"/>
-        </w:pBdr>
-        <w:shd w:fill="auto" w:val="clear"/>
-        <w:spacing w:after="0" w:before="0" w:line="240" w:lineRule="auto"/>
-        <w:ind w:left="0" w:right="0" w:firstLine="0"/>
-        <w:jc w:val="both"/>
-        <w:rPr>
-          <w:rFonts w:ascii="Calibri" w:cs="Calibri" w:eastAsia="Calibri" w:hAnsi="Calibri"/>
-          <w:b w:val="0"/>
-          <w:i w:val="0"/>
-          <w:smallCaps w:val="0"/>
-          <w:strike w:val="0"/>
-          <w:color w:val="000000"/>
-          <w:sz w:val="24"/>
-          <w:szCs w:val="24"/>
-          <w:u w:val="none"/>
-          <w:shd w:fill="auto" w:val="clear"/>
-          <w:vertAlign w:val="baseline"/>
-        </w:rPr>
-      </w:pPr>
-      <w:r>
-        <w:rPr>
-          <w:rFonts w:ascii="Calibri" w:cs="Calibri" w:eastAsia="Calibri" w:hAnsi="Calibri"/>
-          <w:b w:val="1"/>
-          <w:i w:val="0"/>
-          <w:smallCaps w:val="0"/>
-          <w:strike w:val="0"/>
-          <w:color w:val="000000"/>
-          <w:sz w:val="24"/>
-          <w:szCs w:val="24"/>
-          <w:u w:val="none"/>
-          <w:shd w:fill="auto" w:val="clear"/>
-          <w:vertAlign w:val="baseline"/>
-          <w:rtl w:val="0"/>
-        </w:rPr>
-        <w:t xml:space="preserve">2008 – 2010.</w:t>
-      </w:r>
-      <w:r>
-        <w:rPr>
-          <w:rFonts w:ascii="Calibri" w:cs="Calibri" w:eastAsia="Calibri" w:hAnsi="Calibri"/>
-          <w:b w:val="0"/>
-          <w:i w:val="0"/>
-          <w:smallCaps w:val="0"/>
-          <w:strike w:val="0"/>
-          <w:color w:val="000000"/>
-          <w:sz w:val="24"/>
-          <w:szCs w:val="24"/>
-          <w:u w:val="none"/>
-          <w:shd w:fill="auto" w:val="clear"/>
-          <w:vertAlign w:val="baseline"/>
-          <w:rtl w:val="0"/>
-        </w:rPr>
-        <w:t xml:space="preserve"> Монтажник слаботочных сетей</w:t>
-      </w:r>
-    </w:p>
-    <w:p>
-      <w:pPr>
-        <w:keepNext w:val="0"/>
-        <w:keepLines w:val="0"/>
-        <w:pageBreakBefore w:val="0"/>
-        <w:widowControl w:val="1"/>
-        <w:pBdr>
-          <w:top w:space="0" w:sz="0" w:val="nil"/>
-          <w:left w:space="0" w:sz="0" w:val="nil"/>
-          <w:bottom w:space="0" w:sz="0" w:val="nil"/>
-          <w:right w:space="0" w:sz="0" w:val="nil"/>
-          <w:between w:space="0" w:sz="0" w:val="nil"/>
-        </w:pBdr>
-        <w:shd w:fill="auto" w:val="clear"/>
-        <w:spacing w:after="0" w:before="0" w:line="240" w:lineRule="auto"/>
-        <w:ind w:left="0" w:right="0" w:firstLine="0"/>
-        <w:jc w:val="both"/>
-        <w:rPr>
-          <w:rFonts w:ascii="Calibri" w:cs="Calibri" w:eastAsia="Calibri" w:hAnsi="Calibri"/>
-          <w:b w:val="0"/>
-          <w:i w:val="0"/>
-          <w:smallCaps w:val="0"/>
-          <w:strike w:val="0"/>
-          <w:color w:val="000000"/>
-          <w:sz w:val="24"/>
-          <w:szCs w:val="24"/>
-          <w:u w:val="none"/>
-          <w:shd w:fill="auto" w:val="clear"/>
-          <w:vertAlign w:val="baseline"/>
-        </w:rPr>
-      </w:pPr>
-      <w:r>
-        <w:rPr>
-          <w:rFonts w:ascii="Calibri" w:cs="Calibri" w:eastAsia="Calibri" w:hAnsi="Calibri"/>
-          <w:b w:val="0"/>
-          <w:i w:val="0"/>
-          <w:smallCaps w:val="0"/>
-          <w:strike w:val="0"/>
-          <w:color w:val="000000"/>
-          <w:sz w:val="24"/>
-          <w:szCs w:val="24"/>
-          <w:u w:val="none"/>
-          <w:shd w:fill="auto" w:val="clear"/>
-          <w:vertAlign w:val="baseline"/>
-          <w:rtl w:val="0"/>
-        </w:rPr>
-        <w:t xml:space="preserve">ЧП Конкорд, г. Дн</w:t>
-      </w:r>
-      <w:r>
-        <w:rPr>
-          <w:sz w:val="24"/>
-          <w:szCs w:val="24"/>
-          <w:rtl w:val="0"/>
-        </w:rPr>
-        <w:t xml:space="preserve">е</w:t>
-      </w:r>
-      <w:r>
-        <w:rPr>
-          <w:rFonts w:ascii="Calibri" w:cs="Calibri" w:eastAsia="Calibri" w:hAnsi="Calibri"/>
-          <w:b w:val="0"/>
-          <w:i w:val="0"/>
-          <w:smallCaps w:val="0"/>
-          <w:strike w:val="0"/>
-          <w:color w:val="000000"/>
-          <w:sz w:val="24"/>
-          <w:szCs w:val="24"/>
-          <w:u w:val="none"/>
-          <w:shd w:fill="auto" w:val="clear"/>
-          <w:vertAlign w:val="baseline"/>
-          <w:rtl w:val="0"/>
-        </w:rPr>
-        <w:t xml:space="preserve">пр</w:t>
-      </w:r>
-    </w:p>
-    <w:p>
-      <w:pPr>
-        <w:keepNext w:val="0"/>
-        <w:keepLines w:val="0"/>
-        <w:pageBreakBefore w:val="0"/>
-        <w:widowControl w:val="1"/>
-        <w:pBdr>
-          <w:top w:space="0" w:sz="0" w:val="nil"/>
-          <w:left w:space="0" w:sz="0" w:val="nil"/>
-          <w:bottom w:space="0" w:sz="0" w:val="nil"/>
-          <w:right w:space="0" w:sz="0" w:val="nil"/>
-          <w:between w:space="0" w:sz="0" w:val="nil"/>
-        </w:pBdr>
-        <w:shd w:fill="auto" w:val="clear"/>
-        <w:spacing w:after="0" w:before="0" w:line="240" w:lineRule="auto"/>
-        <w:ind w:left="0" w:right="0" w:firstLine="0"/>
-        <w:jc w:val="left"/>
-        <w:rPr>
-          <w:rFonts w:ascii="Calibri" w:cs="Calibri" w:eastAsia="Calibri" w:hAnsi="Calibri"/>
-          <w:b w:val="0"/>
-          <w:i w:val="0"/>
-          <w:smallCaps w:val="0"/>
-          <w:strike w:val="0"/>
-          <w:color w:val="000000"/>
-          <w:sz w:val="24"/>
-          <w:szCs w:val="24"/>
-          <w:u w:val="none"/>
-          <w:shd w:fill="auto" w:val="clear"/>
-          <w:vertAlign w:val="baseline"/>
-        </w:rPr>
-      </w:pPr>
-      <w:r>
-        <w:rPr>
-          <w:rFonts w:ascii="Calibri" w:cs="Calibri" w:eastAsia="Calibri" w:hAnsi="Calibri"/>
-          <w:b w:val="0"/>
-          <w:i w:val="0"/>
-          <w:smallCaps w:val="0"/>
-          <w:strike w:val="0"/>
-          <w:color w:val="000000"/>
-          <w:sz w:val="24"/>
-          <w:szCs w:val="24"/>
-          <w:u w:val="none"/>
-          <w:shd w:fill="auto" w:val="clear"/>
-          <w:vertAlign w:val="baseline"/>
-          <w:rtl w:val="0"/>
-        </w:rPr>
-        <w:t xml:space="preserve">Сфера деятельности компании: установка и обслуживание систем безопасности и видеонаблюдения.</w:t>
+        <w:t xml:space="preserve">Техническое обслуживание ПК (около 40 штук) и локальной сети.</w:t>
       </w:r>
     </w:p>
     <w:p>
@@ -2607,35 +2382,26 @@
           <w:color w:val="000000"/>
           <w:sz w:val="24"/>
           <w:szCs w:val="24"/>
-          <w:highlight w:val="white"/>
-          <w:u w:val="none"/>
-        </w:rPr>
-      </w:pPr>
-      <w:r>
-        <w:rPr>
-          <w:sz w:val="24"/>
-          <w:szCs w:val="24"/>
-          <w:highlight w:val="white"/>
-          <w:rtl w:val="0"/>
-        </w:rPr>
-        <w:t xml:space="preserve">Проектирование</w:t>
-      </w:r>
-      <w:r>
-        <w:rPr>
-          <w:rFonts w:ascii="Calibri" w:cs="Calibri" w:eastAsia="Calibri" w:hAnsi="Calibri"/>
-          <w:b w:val="0"/>
-          <w:i w:val="0"/>
-          <w:smallCaps w:val="0"/>
-          <w:strike w:val="0"/>
-          <w:color w:val="000000"/>
-          <w:sz w:val="24"/>
-          <w:szCs w:val="24"/>
-          <w:highlight w:val="white"/>
-          <w:u w:val="none"/>
-          <w:vertAlign w:val="baseline"/>
-          <w:rtl w:val="0"/>
-        </w:rPr>
-        <w:t xml:space="preserve"> схем расположения оборудования для безопасности.</w:t>
+          <w:u w:val="none"/>
+          <w:shd w:fill="auto" w:val="clear"/>
+        </w:rPr>
+      </w:pPr>
+      <w:r>
+        <w:rPr>
+          <w:rFonts w:ascii="Calibri" w:cs="Calibri" w:eastAsia="Calibri" w:hAnsi="Calibri"/>
+          <w:b w:val="0"/>
+          <w:i w:val="0"/>
+          <w:smallCaps w:val="0"/>
+          <w:strike w:val="0"/>
+          <w:color w:val="000000"/>
+          <w:sz w:val="24"/>
+          <w:szCs w:val="24"/>
+          <w:u w:val="none"/>
+          <w:shd w:fill="auto" w:val="clear"/>
+          <w:vertAlign w:val="baseline"/>
+          <w:rtl w:val="0"/>
+        </w:rPr>
+        <w:t xml:space="preserve">Инструктаж и работа с заявками о неисправностях от пользователей.</w:t>
       </w:r>
     </w:p>
     <w:p>
@@ -2667,26 +2433,26 @@
           <w:color w:val="000000"/>
           <w:sz w:val="24"/>
           <w:szCs w:val="24"/>
-          <w:highlight w:val="white"/>
-          <w:u w:val="none"/>
-        </w:rPr>
-      </w:pPr>
-      <w:r>
-        <w:rPr>
-          <w:rFonts w:ascii="Calibri" w:cs="Calibri" w:eastAsia="Calibri" w:hAnsi="Calibri"/>
-          <w:b w:val="0"/>
-          <w:i w:val="0"/>
-          <w:smallCaps w:val="0"/>
-          <w:strike w:val="0"/>
-          <w:color w:val="000000"/>
-          <w:sz w:val="24"/>
-          <w:szCs w:val="24"/>
-          <w:highlight w:val="white"/>
-          <w:u w:val="none"/>
-          <w:vertAlign w:val="baseline"/>
-          <w:rtl w:val="0"/>
-        </w:rPr>
-        <w:t xml:space="preserve">Установка оборудования.</w:t>
+          <w:u w:val="none"/>
+          <w:shd w:fill="auto" w:val="clear"/>
+        </w:rPr>
+      </w:pPr>
+      <w:r>
+        <w:rPr>
+          <w:rFonts w:ascii="Calibri" w:cs="Calibri" w:eastAsia="Calibri" w:hAnsi="Calibri"/>
+          <w:b w:val="0"/>
+          <w:i w:val="0"/>
+          <w:smallCaps w:val="0"/>
+          <w:strike w:val="0"/>
+          <w:color w:val="000000"/>
+          <w:sz w:val="24"/>
+          <w:szCs w:val="24"/>
+          <w:u w:val="none"/>
+          <w:shd w:fill="auto" w:val="clear"/>
+          <w:vertAlign w:val="baseline"/>
+          <w:rtl w:val="0"/>
+        </w:rPr>
+        <w:t xml:space="preserve">Мониторинг работоспособности сетевого оборудования.</w:t>
       </w:r>
     </w:p>
     <w:p>
@@ -2718,26 +2484,26 @@
           <w:color w:val="000000"/>
           <w:sz w:val="24"/>
           <w:szCs w:val="24"/>
-          <w:highlight w:val="white"/>
-          <w:u w:val="none"/>
-        </w:rPr>
-      </w:pPr>
-      <w:r>
-        <w:rPr>
-          <w:rFonts w:ascii="Calibri" w:cs="Calibri" w:eastAsia="Calibri" w:hAnsi="Calibri"/>
-          <w:b w:val="0"/>
-          <w:i w:val="0"/>
-          <w:smallCaps w:val="0"/>
-          <w:strike w:val="0"/>
-          <w:color w:val="000000"/>
-          <w:sz w:val="24"/>
-          <w:szCs w:val="24"/>
-          <w:highlight w:val="white"/>
-          <w:u w:val="none"/>
-          <w:vertAlign w:val="baseline"/>
-          <w:rtl w:val="0"/>
-        </w:rPr>
-        <w:t xml:space="preserve">Администрирование и программирование модулей управления.</w:t>
+          <w:u w:val="none"/>
+          <w:shd w:fill="auto" w:val="clear"/>
+        </w:rPr>
+      </w:pPr>
+      <w:r>
+        <w:rPr>
+          <w:rFonts w:ascii="Calibri" w:cs="Calibri" w:eastAsia="Calibri" w:hAnsi="Calibri"/>
+          <w:b w:val="0"/>
+          <w:i w:val="0"/>
+          <w:smallCaps w:val="0"/>
+          <w:strike w:val="0"/>
+          <w:color w:val="000000"/>
+          <w:sz w:val="24"/>
+          <w:szCs w:val="24"/>
+          <w:u w:val="none"/>
+          <w:shd w:fill="auto" w:val="clear"/>
+          <w:vertAlign w:val="baseline"/>
+          <w:rtl w:val="0"/>
+        </w:rPr>
+        <w:t xml:space="preserve">Поддержка работоспособности, устранение возникающих неполадок.</w:t>
       </w:r>
     </w:p>
     <w:p>
@@ -2788,221 +2554,21 @@
           <w:vertAlign w:val="baseline"/>
           <w:rtl w:val="0"/>
         </w:rPr>
-        <w:t xml:space="preserve">Администрирование серверов.</w:t>
-      </w:r>
-    </w:p>
-    <w:p>
-      <w:pPr>
-        <w:keepNext w:val="0"/>
-        <w:keepLines w:val="0"/>
-        <w:pageBreakBefore w:val="0"/>
-        <w:widowControl w:val="1"/>
-        <w:pBdr>
-          <w:top w:space="0" w:sz="0" w:val="nil"/>
-          <w:left w:space="0" w:sz="0" w:val="nil"/>
-          <w:bottom w:space="0" w:sz="0" w:val="nil"/>
-          <w:right w:space="0" w:sz="0" w:val="nil"/>
-          <w:between w:space="0" w:sz="0" w:val="nil"/>
-        </w:pBdr>
-        <w:shd w:fill="auto" w:val="clear"/>
-        <w:spacing w:after="0" w:before="0" w:line="240" w:lineRule="auto"/>
-        <w:ind w:left="720" w:right="0" w:hanging="720"/>
-        <w:jc w:val="left"/>
-        <w:rPr>
-          <w:rFonts w:ascii="Calibri" w:cs="Calibri" w:eastAsia="Calibri" w:hAnsi="Calibri"/>
-          <w:b w:val="0"/>
-          <w:i w:val="0"/>
-          <w:smallCaps w:val="0"/>
-          <w:strike w:val="0"/>
-          <w:color w:val="000000"/>
+        <w:t xml:space="preserve">Обеспечение работоспособности устройств и ПО сотрудников. </w:t>
+      </w:r>
+      <w:r>
+        <w:rPr>
           <w:sz w:val="24"/>
           <w:szCs w:val="24"/>
           <w:highlight w:val="white"/>
-          <w:u w:val="none"/>
-          <w:vertAlign w:val="baseline"/>
-        </w:rPr>
-      </w:pPr>
-      <w:r>
-        <w:rPr>
-          <w:rtl w:val="0"/>
-        </w:rPr>
-      </w:r>
-    </w:p>
-    <w:p>
-      <w:pPr>
-        <w:keepNext w:val="0"/>
-        <w:keepLines w:val="0"/>
-        <w:pageBreakBefore w:val="0"/>
-        <w:widowControl w:val="1"/>
-        <w:pBdr>
-          <w:top w:space="0" w:sz="0" w:val="nil"/>
-          <w:left w:space="0" w:sz="0" w:val="nil"/>
-          <w:bottom w:space="0" w:sz="0" w:val="nil"/>
-          <w:right w:space="0" w:sz="0" w:val="nil"/>
-          <w:between w:space="0" w:sz="0" w:val="nil"/>
-        </w:pBdr>
-        <w:shd w:fill="auto" w:val="clear"/>
-        <w:spacing w:after="0" w:before="0" w:line="240" w:lineRule="auto"/>
-        <w:ind w:left="0" w:right="0" w:firstLine="0"/>
-        <w:jc w:val="both"/>
-        <w:rPr>
-          <w:rFonts w:ascii="Calibri" w:cs="Calibri" w:eastAsia="Calibri" w:hAnsi="Calibri"/>
-          <w:b w:val="0"/>
-          <w:i w:val="0"/>
-          <w:smallCaps w:val="0"/>
-          <w:strike w:val="0"/>
-          <w:color w:val="000000"/>
-          <w:sz w:val="24"/>
-          <w:szCs w:val="24"/>
-          <w:u w:val="none"/>
-          <w:shd w:fill="auto" w:val="clear"/>
-          <w:vertAlign w:val="baseline"/>
-        </w:rPr>
-      </w:pPr>
-      <w:r>
-        <w:rPr>
-          <w:rFonts w:ascii="Calibri" w:cs="Calibri" w:eastAsia="Calibri" w:hAnsi="Calibri"/>
-          <w:b w:val="1"/>
-          <w:i w:val="0"/>
-          <w:smallCaps w:val="0"/>
-          <w:strike w:val="0"/>
-          <w:color w:val="000000"/>
-          <w:sz w:val="24"/>
-          <w:szCs w:val="24"/>
-          <w:u w:val="none"/>
-          <w:shd w:fill="auto" w:val="clear"/>
-          <w:vertAlign w:val="baseline"/>
-          <w:rtl w:val="0"/>
-        </w:rPr>
-        <w:t xml:space="preserve">2010 – 2014</w:t>
-      </w:r>
-      <w:r>
-        <w:rPr>
-          <w:rFonts w:ascii="Calibri" w:cs="Calibri" w:eastAsia="Calibri" w:hAnsi="Calibri"/>
-          <w:b w:val="0"/>
-          <w:i w:val="0"/>
-          <w:smallCaps w:val="0"/>
-          <w:strike w:val="0"/>
-          <w:color w:val="000000"/>
-          <w:sz w:val="24"/>
-          <w:szCs w:val="24"/>
-          <w:u w:val="none"/>
-          <w:shd w:fill="auto" w:val="clear"/>
-          <w:vertAlign w:val="baseline"/>
-          <w:rtl w:val="0"/>
-        </w:rPr>
-        <w:t xml:space="preserve"> Системный администратор</w:t>
-      </w:r>
-    </w:p>
-    <w:p>
-      <w:pPr>
-        <w:keepNext w:val="0"/>
-        <w:keepLines w:val="0"/>
-        <w:pageBreakBefore w:val="0"/>
-        <w:widowControl w:val="1"/>
-        <w:pBdr>
-          <w:top w:space="0" w:sz="0" w:val="nil"/>
-          <w:left w:space="0" w:sz="0" w:val="nil"/>
-          <w:bottom w:space="0" w:sz="0" w:val="nil"/>
-          <w:right w:space="0" w:sz="0" w:val="nil"/>
-          <w:between w:space="0" w:sz="0" w:val="nil"/>
-        </w:pBdr>
-        <w:shd w:fill="auto" w:val="clear"/>
-        <w:spacing w:after="0" w:before="0" w:line="240" w:lineRule="auto"/>
-        <w:ind w:left="0" w:right="0" w:firstLine="0"/>
-        <w:jc w:val="both"/>
-        <w:rPr>
-          <w:rFonts w:ascii="Calibri" w:cs="Calibri" w:eastAsia="Calibri" w:hAnsi="Calibri"/>
-          <w:b w:val="0"/>
-          <w:i w:val="0"/>
-          <w:smallCaps w:val="0"/>
-          <w:strike w:val="0"/>
-          <w:color w:val="000000"/>
-          <w:sz w:val="24"/>
-          <w:szCs w:val="24"/>
-          <w:u w:val="none"/>
-          <w:shd w:fill="auto" w:val="clear"/>
-          <w:vertAlign w:val="baseline"/>
-        </w:rPr>
-      </w:pPr>
-      <w:r>
-        <w:rPr>
-          <w:rFonts w:ascii="Calibri" w:cs="Calibri" w:eastAsia="Calibri" w:hAnsi="Calibri"/>
-          <w:b w:val="0"/>
-          <w:i w:val="0"/>
-          <w:smallCaps w:val="0"/>
-          <w:strike w:val="0"/>
-          <w:color w:val="000000"/>
-          <w:sz w:val="24"/>
-          <w:szCs w:val="24"/>
-          <w:u w:val="none"/>
-          <w:shd w:fill="auto" w:val="clear"/>
-          <w:vertAlign w:val="baseline"/>
-          <w:rtl w:val="0"/>
-        </w:rPr>
-        <w:t xml:space="preserve">GreenSolution, г. </w:t>
-      </w:r>
-      <w:r>
-        <w:rPr>
-          <w:sz w:val="24"/>
-          <w:szCs w:val="24"/>
-          <w:rtl w:val="0"/>
-        </w:rPr>
-        <w:t xml:space="preserve">Днепр</w:t>
-      </w:r>
-      <w:r>
-        <w:rPr>
-          <w:rtl w:val="0"/>
-        </w:rPr>
-      </w:r>
-    </w:p>
-    <w:p>
-      <w:pPr>
-        <w:keepNext w:val="0"/>
-        <w:keepLines w:val="0"/>
-        <w:pageBreakBefore w:val="0"/>
-        <w:widowControl w:val="1"/>
-        <w:pBdr>
-          <w:top w:space="0" w:sz="0" w:val="nil"/>
-          <w:left w:space="0" w:sz="0" w:val="nil"/>
-          <w:bottom w:space="0" w:sz="0" w:val="nil"/>
-          <w:right w:space="0" w:sz="0" w:val="nil"/>
-          <w:between w:space="0" w:sz="0" w:val="nil"/>
-        </w:pBdr>
-        <w:shd w:fill="auto" w:val="clear"/>
-        <w:spacing w:after="0" w:before="0" w:line="240" w:lineRule="auto"/>
-        <w:ind w:left="0" w:right="0" w:firstLine="0"/>
-        <w:jc w:val="left"/>
-        <w:rPr>
-          <w:rFonts w:ascii="Calibri" w:cs="Calibri" w:eastAsia="Calibri" w:hAnsi="Calibri"/>
-          <w:b w:val="0"/>
-          <w:i w:val="0"/>
-          <w:smallCaps w:val="0"/>
-          <w:strike w:val="0"/>
-          <w:color w:val="000000"/>
-          <w:sz w:val="24"/>
-          <w:szCs w:val="24"/>
-          <w:u w:val="none"/>
-          <w:shd w:fill="auto" w:val="clear"/>
-          <w:vertAlign w:val="baseline"/>
-        </w:rPr>
-      </w:pPr>
-      <w:r>
-        <w:rPr>
-          <w:rFonts w:ascii="Calibri" w:cs="Calibri" w:eastAsia="Calibri" w:hAnsi="Calibri"/>
-          <w:b w:val="0"/>
-          <w:i w:val="0"/>
-          <w:smallCaps w:val="0"/>
-          <w:strike w:val="0"/>
-          <w:color w:val="000000"/>
-          <w:sz w:val="24"/>
-          <w:szCs w:val="24"/>
-          <w:u w:val="none"/>
-          <w:shd w:fill="auto" w:val="clear"/>
-          <w:vertAlign w:val="baseline"/>
-          <w:rtl w:val="0"/>
-        </w:rPr>
-        <w:t xml:space="preserve">Сфера деятельности компании: Разработка веб сайтов и веб приложений</w:t>
+          <w:rtl w:val="0"/>
+        </w:rPr>
+        <w:t xml:space="preserve">Работал с Docker для удобной настройки среды для разработки и тестирования.</w:t>
+      </w:r>
+      <w:r>
+        <w:rPr>
+          <w:rtl w:val="0"/>
+        </w:rPr>
       </w:r>
     </w:p>
     <w:p>
@@ -3023,7 +2589,7 @@
           <w:between w:space="0" w:sz="0" w:val="nil"/>
         </w:pBdr>
         <w:shd w:fill="auto" w:val="clear"/>
-        <w:spacing w:after="0" w:before="280" w:line="240" w:lineRule="auto"/>
+        <w:spacing w:after="0" w:before="0" w:line="240" w:lineRule="auto"/>
         <w:ind w:left="720" w:right="0" w:hanging="360"/>
         <w:jc w:val="left"/>
         <w:rPr>
@@ -3034,26 +2600,26 @@
           <w:color w:val="000000"/>
           <w:sz w:val="24"/>
           <w:szCs w:val="24"/>
-          <w:u w:val="none"/>
-          <w:shd w:fill="auto" w:val="clear"/>
-        </w:rPr>
-      </w:pPr>
-      <w:r>
-        <w:rPr>
-          <w:rFonts w:ascii="Calibri" w:cs="Calibri" w:eastAsia="Calibri" w:hAnsi="Calibri"/>
-          <w:b w:val="0"/>
-          <w:i w:val="0"/>
-          <w:smallCaps w:val="0"/>
-          <w:strike w:val="0"/>
-          <w:color w:val="000000"/>
-          <w:sz w:val="24"/>
-          <w:szCs w:val="24"/>
-          <w:u w:val="none"/>
-          <w:shd w:fill="auto" w:val="clear"/>
-          <w:vertAlign w:val="baseline"/>
-          <w:rtl w:val="0"/>
-        </w:rPr>
-        <w:t xml:space="preserve">Администрирование локальных сетей, серверов, рабочих станций.</w:t>
+          <w:highlight w:val="white"/>
+          <w:u w:val="none"/>
+        </w:rPr>
+      </w:pPr>
+      <w:r>
+        <w:rPr>
+          <w:rFonts w:ascii="Calibri" w:cs="Calibri" w:eastAsia="Calibri" w:hAnsi="Calibri"/>
+          <w:b w:val="0"/>
+          <w:i w:val="0"/>
+          <w:smallCaps w:val="0"/>
+          <w:strike w:val="0"/>
+          <w:color w:val="000000"/>
+          <w:sz w:val="24"/>
+          <w:szCs w:val="24"/>
+          <w:highlight w:val="white"/>
+          <w:u w:val="none"/>
+          <w:vertAlign w:val="baseline"/>
+          <w:rtl w:val="0"/>
+        </w:rPr>
+        <w:t xml:space="preserve">Комплексная техподдержка и работа по ликвидации вирусов и вредоносных программ.</w:t>
       </w:r>
     </w:p>
     <w:p>
@@ -3085,26 +2651,140 @@
           <w:color w:val="000000"/>
           <w:sz w:val="24"/>
           <w:szCs w:val="24"/>
-          <w:u w:val="none"/>
-          <w:shd w:fill="auto" w:val="clear"/>
-        </w:rPr>
-      </w:pPr>
-      <w:r>
-        <w:rPr>
-          <w:rFonts w:ascii="Calibri" w:cs="Calibri" w:eastAsia="Calibri" w:hAnsi="Calibri"/>
-          <w:b w:val="0"/>
-          <w:i w:val="0"/>
-          <w:smallCaps w:val="0"/>
-          <w:strike w:val="0"/>
-          <w:color w:val="000000"/>
-          <w:sz w:val="24"/>
-          <w:szCs w:val="24"/>
-          <w:u w:val="none"/>
-          <w:shd w:fill="auto" w:val="clear"/>
-          <w:vertAlign w:val="baseline"/>
-          <w:rtl w:val="0"/>
-        </w:rPr>
-        <w:t xml:space="preserve">Техническое обслуживание ПК (около 40 штук) и локальной сети.</w:t>
+          <w:highlight w:val="white"/>
+          <w:u w:val="none"/>
+        </w:rPr>
+      </w:pPr>
+      <w:r>
+        <w:rPr>
+          <w:rFonts w:ascii="Calibri" w:cs="Calibri" w:eastAsia="Calibri" w:hAnsi="Calibri"/>
+          <w:b w:val="0"/>
+          <w:i w:val="0"/>
+          <w:smallCaps w:val="0"/>
+          <w:strike w:val="0"/>
+          <w:color w:val="000000"/>
+          <w:sz w:val="24"/>
+          <w:szCs w:val="24"/>
+          <w:highlight w:val="white"/>
+          <w:u w:val="none"/>
+          <w:vertAlign w:val="baseline"/>
+          <w:rtl w:val="0"/>
+        </w:rPr>
+        <w:t xml:space="preserve">Подготовка и настройка рабочих мест для новых сотрудников компании.</w:t>
+      </w:r>
+    </w:p>
+    <w:p>
+      <w:pPr>
+        <w:keepNext w:val="0"/>
+        <w:keepLines w:val="0"/>
+        <w:pageBreakBefore w:val="0"/>
+        <w:widowControl w:val="1"/>
+        <w:pBdr>
+          <w:top w:space="0" w:sz="0" w:val="nil"/>
+          <w:left w:space="0" w:sz="0" w:val="nil"/>
+          <w:bottom w:space="0" w:sz="0" w:val="nil"/>
+          <w:right w:space="0" w:sz="0" w:val="nil"/>
+          <w:between w:space="0" w:sz="0" w:val="nil"/>
+        </w:pBdr>
+        <w:shd w:fill="auto" w:val="clear"/>
+        <w:spacing w:after="0" w:before="0" w:line="240" w:lineRule="auto"/>
+        <w:ind w:left="0" w:right="0" w:firstLine="0"/>
+        <w:jc w:val="both"/>
+        <w:rPr>
+          <w:rFonts w:ascii="Calibri" w:cs="Calibri" w:eastAsia="Calibri" w:hAnsi="Calibri"/>
+          <w:b w:val="0"/>
+          <w:i w:val="0"/>
+          <w:smallCaps w:val="0"/>
+          <w:strike w:val="0"/>
+          <w:color w:val="000000"/>
+          <w:sz w:val="24"/>
+          <w:szCs w:val="24"/>
+          <w:u w:val="none"/>
+          <w:shd w:fill="auto" w:val="clear"/>
+          <w:vertAlign w:val="baseline"/>
+        </w:rPr>
+      </w:pPr>
+      <w:r>
+        <w:rPr>
+          <w:rFonts w:ascii="Calibri" w:cs="Calibri" w:eastAsia="Calibri" w:hAnsi="Calibri"/>
+          <w:b w:val="1"/>
+          <w:i w:val="0"/>
+          <w:smallCaps w:val="0"/>
+          <w:strike w:val="0"/>
+          <w:color w:val="000000"/>
+          <w:sz w:val="24"/>
+          <w:szCs w:val="24"/>
+          <w:u w:val="none"/>
+          <w:shd w:fill="auto" w:val="clear"/>
+          <w:vertAlign w:val="baseline"/>
+          <w:rtl w:val="0"/>
+        </w:rPr>
+        <w:t xml:space="preserve">2014 – 2018</w:t>
+      </w:r>
+      <w:r>
+        <w:rPr>
+          <w:rFonts w:ascii="Calibri" w:cs="Calibri" w:eastAsia="Calibri" w:hAnsi="Calibri"/>
+          <w:b w:val="0"/>
+          <w:i w:val="0"/>
+          <w:smallCaps w:val="0"/>
+          <w:strike w:val="0"/>
+          <w:color w:val="000000"/>
+          <w:sz w:val="24"/>
+          <w:szCs w:val="24"/>
+          <w:u w:val="none"/>
+          <w:shd w:fill="auto" w:val="clear"/>
+          <w:vertAlign w:val="baseline"/>
+          <w:rtl w:val="0"/>
+        </w:rPr>
+        <w:t xml:space="preserve"> Фронтенд разработчик</w:t>
+      </w:r>
+    </w:p>
+    <w:p>
+      <w:pPr>
+        <w:keepNext w:val="0"/>
+        <w:keepLines w:val="0"/>
+        <w:pageBreakBefore w:val="0"/>
+        <w:widowControl w:val="1"/>
+        <w:pBdr>
+          <w:top w:space="0" w:sz="0" w:val="nil"/>
+          <w:left w:space="0" w:sz="0" w:val="nil"/>
+          <w:bottom w:space="0" w:sz="0" w:val="nil"/>
+          <w:right w:space="0" w:sz="0" w:val="nil"/>
+          <w:between w:space="0" w:sz="0" w:val="nil"/>
+        </w:pBdr>
+        <w:shd w:fill="auto" w:val="clear"/>
+        <w:spacing w:after="0" w:before="0" w:line="240" w:lineRule="auto"/>
+        <w:ind w:left="0" w:right="0" w:firstLine="0"/>
+        <w:jc w:val="both"/>
+        <w:rPr>
+          <w:sz w:val="24"/>
+          <w:szCs w:val="24"/>
+        </w:rPr>
+      </w:pPr>
+      <w:r>
+        <w:rPr>
+          <w:rFonts w:ascii="Calibri" w:cs="Calibri" w:eastAsia="Calibri" w:hAnsi="Calibri"/>
+          <w:b w:val="0"/>
+          <w:i w:val="0"/>
+          <w:smallCaps w:val="0"/>
+          <w:strike w:val="0"/>
+          <w:color w:val="000000"/>
+          <w:sz w:val="24"/>
+          <w:szCs w:val="24"/>
+          <w:u w:val="none"/>
+          <w:shd w:fill="auto" w:val="clear"/>
+          <w:vertAlign w:val="baseline"/>
+          <w:rtl w:val="0"/>
+        </w:rPr>
+        <w:t xml:space="preserve">Биржа фриланс, г. </w:t>
+      </w:r>
+      <w:r>
+        <w:rPr>
+          <w:sz w:val="24"/>
+          <w:szCs w:val="24"/>
+          <w:rtl w:val="0"/>
+        </w:rPr>
+        <w:t xml:space="preserve">Днепр.</w:t>
       </w:r>
     </w:p>
     <w:p>
@@ -3127,35 +2807,37 @@
         <w:shd w:fill="auto" w:val="clear"/>
         <w:spacing w:after="0" w:before="0" w:line="240" w:lineRule="auto"/>
         <w:ind w:left="720" w:right="0" w:hanging="360"/>
-        <w:jc w:val="left"/>
-        <w:rPr>
-          <w:b w:val="0"/>
-          <w:i w:val="0"/>
-          <w:smallCaps w:val="0"/>
-          <w:strike w:val="0"/>
-          <w:color w:val="000000"/>
-          <w:sz w:val="24"/>
-          <w:szCs w:val="24"/>
-          <w:u w:val="none"/>
-          <w:shd w:fill="auto" w:val="clear"/>
-        </w:rPr>
-      </w:pPr>
-      <w:r>
-        <w:rPr>
-          <w:rFonts w:ascii="Calibri" w:cs="Calibri" w:eastAsia="Calibri" w:hAnsi="Calibri"/>
-          <w:b w:val="0"/>
-          <w:i w:val="0"/>
-          <w:smallCaps w:val="0"/>
-          <w:strike w:val="0"/>
-          <w:color w:val="000000"/>
-          <w:sz w:val="24"/>
-          <w:szCs w:val="24"/>
-          <w:u w:val="none"/>
-          <w:shd w:fill="auto" w:val="clear"/>
-          <w:vertAlign w:val="baseline"/>
-          <w:rtl w:val="0"/>
-        </w:rPr>
-        <w:t xml:space="preserve">Инструктаж и работа с заявками о неисправностях от пользователей.</w:t>
+        <w:jc w:val="both"/>
+        <w:rPr>
+          <w:rFonts w:ascii="Calibri" w:cs="Calibri" w:eastAsia="Calibri" w:hAnsi="Calibri"/>
+          <w:b w:val="0"/>
+          <w:i w:val="0"/>
+          <w:smallCaps w:val="0"/>
+          <w:strike w:val="0"/>
+          <w:color w:val="000000"/>
+          <w:sz w:val="24"/>
+          <w:szCs w:val="24"/>
+          <w:u w:val="none"/>
+          <w:shd w:fill="auto" w:val="clear"/>
+          <w:vertAlign w:val="baseline"/>
+        </w:rPr>
+      </w:pPr>
+      <w:r>
+        <w:rPr>
+          <w:rFonts w:ascii="Calibri" w:cs="Calibri" w:eastAsia="Calibri" w:hAnsi="Calibri"/>
+          <w:b w:val="0"/>
+          <w:i w:val="0"/>
+          <w:smallCaps w:val="0"/>
+          <w:strike w:val="0"/>
+          <w:color w:val="000000"/>
+          <w:sz w:val="24"/>
+          <w:szCs w:val="24"/>
+          <w:u w:val="none"/>
+          <w:shd w:fill="auto" w:val="clear"/>
+          <w:vertAlign w:val="baseline"/>
+          <w:rtl w:val="0"/>
+        </w:rPr>
+        <w:t xml:space="preserve">Выполнение заказов по созданию дизайна веб сайтов.</w:t>
       </w:r>
     </w:p>
     <w:p>
@@ -3206,7 +2888,7 @@
           <w:vertAlign w:val="baseline"/>
           <w:rtl w:val="0"/>
         </w:rPr>
-        <w:t xml:space="preserve">Мониторинг работоспособности сетевого оборудования.</w:t>
+        <w:t xml:space="preserve">Выполнение заказов по HTML верстке дизайна.</w:t>
       </w:r>
     </w:p>
     <w:p>
@@ -3257,7 +2939,7 @@
           <w:vertAlign w:val="baseline"/>
           <w:rtl w:val="0"/>
         </w:rPr>
-        <w:t xml:space="preserve">Поддержка работоспособности, устранение возникающих неполадок.</w:t>
+        <w:t xml:space="preserve">Адаптивная верстка.</w:t>
       </w:r>
     </w:p>
     <w:p>
@@ -3278,7 +2960,7 @@
           <w:between w:space="0" w:sz="0" w:val="nil"/>
         </w:pBdr>
         <w:shd w:fill="auto" w:val="clear"/>
-        <w:spacing w:after="0" w:before="0" w:line="240" w:lineRule="auto"/>
+        <w:spacing w:after="280" w:before="0" w:line="240" w:lineRule="auto"/>
         <w:ind w:left="720" w:right="0" w:hanging="360"/>
         <w:jc w:val="left"/>
         <w:rPr>
@@ -3289,40 +2971,120 @@
           <w:color w:val="000000"/>
           <w:sz w:val="24"/>
           <w:szCs w:val="24"/>
-          <w:highlight w:val="white"/>
-          <w:u w:val="none"/>
-        </w:rPr>
-      </w:pPr>
-      <w:r>
-        <w:rPr>
-          <w:rFonts w:ascii="Calibri" w:cs="Calibri" w:eastAsia="Calibri" w:hAnsi="Calibri"/>
-          <w:b w:val="0"/>
-          <w:i w:val="0"/>
-          <w:smallCaps w:val="0"/>
-          <w:strike w:val="0"/>
-          <w:color w:val="000000"/>
-          <w:sz w:val="24"/>
-          <w:szCs w:val="24"/>
-          <w:highlight w:val="white"/>
-          <w:u w:val="none"/>
-          <w:vertAlign w:val="baseline"/>
-          <w:rtl w:val="0"/>
-        </w:rPr>
-        <w:t xml:space="preserve">Обеспечение работоспособности устройств и ПО сотрудников. </w:t>
-      </w:r>
-      <w:r>
-        <w:rPr>
-          <w:sz w:val="24"/>
-          <w:szCs w:val="24"/>
-          <w:highlight w:val="white"/>
-          <w:rtl w:val="0"/>
-        </w:rPr>
-        <w:t xml:space="preserve">Работал с Docker для удобной настройки среды для разработки и тестирования.</w:t>
-      </w:r>
-      <w:r>
-        <w:rPr>
-          <w:rtl w:val="0"/>
-        </w:rPr>
+          <w:u w:val="none"/>
+          <w:shd w:fill="auto" w:val="clear"/>
+        </w:rPr>
+      </w:pPr>
+      <w:r>
+        <w:rPr>
+          <w:rFonts w:ascii="Calibri" w:cs="Calibri" w:eastAsia="Calibri" w:hAnsi="Calibri"/>
+          <w:b w:val="0"/>
+          <w:i w:val="0"/>
+          <w:smallCaps w:val="0"/>
+          <w:strike w:val="0"/>
+          <w:color w:val="000000"/>
+          <w:sz w:val="24"/>
+          <w:szCs w:val="24"/>
+          <w:u w:val="none"/>
+          <w:shd w:fill="auto" w:val="clear"/>
+          <w:vertAlign w:val="baseline"/>
+          <w:rtl w:val="0"/>
+        </w:rPr>
+        <w:t xml:space="preserve">Интеграция в CMS;</w:t>
+      </w:r>
+    </w:p>
+    <w:p>
+      <w:pPr>
+        <w:keepNext w:val="0"/>
+        <w:keepLines w:val="0"/>
+        <w:pageBreakBefore w:val="0"/>
+        <w:widowControl w:val="1"/>
+        <w:pBdr>
+          <w:top w:space="0" w:sz="0" w:val="nil"/>
+          <w:left w:space="0" w:sz="0" w:val="nil"/>
+          <w:bottom w:space="0" w:sz="0" w:val="nil"/>
+          <w:right w:space="0" w:sz="0" w:val="nil"/>
+          <w:between w:space="0" w:sz="0" w:val="nil"/>
+        </w:pBdr>
+        <w:shd w:fill="auto" w:val="clear"/>
+        <w:spacing w:after="0" w:before="0" w:line="240" w:lineRule="auto"/>
+        <w:ind w:left="0" w:right="0" w:firstLine="0"/>
+        <w:jc w:val="both"/>
+        <w:rPr>
+          <w:rFonts w:ascii="Calibri" w:cs="Calibri" w:eastAsia="Calibri" w:hAnsi="Calibri"/>
+          <w:b w:val="0"/>
+          <w:i w:val="0"/>
+          <w:smallCaps w:val="0"/>
+          <w:strike w:val="0"/>
+          <w:color w:val="000000"/>
+          <w:sz w:val="24"/>
+          <w:szCs w:val="24"/>
+          <w:u w:val="none"/>
+          <w:shd w:fill="auto" w:val="clear"/>
+          <w:vertAlign w:val="baseline"/>
+        </w:rPr>
+      </w:pPr>
+      <w:r>
+        <w:rPr>
+          <w:b w:val="1"/>
+          <w:sz w:val="24"/>
+          <w:szCs w:val="24"/>
+          <w:rtl w:val="0"/>
+        </w:rPr>
+        <w:t xml:space="preserve">2018 – 2022 IT - специалист </w:t>
+      </w:r>
+      <w:r>
+        <w:rPr>
+          <w:rtl w:val="0"/>
+        </w:rPr>
+      </w:r>
+    </w:p>
+    <w:p>
+      <w:pPr>
+        <w:keepNext w:val="0"/>
+        <w:keepLines w:val="0"/>
+        <w:pageBreakBefore w:val="0"/>
+        <w:widowControl w:val="1"/>
+        <w:pBdr>
+          <w:top w:space="0" w:sz="0" w:val="nil"/>
+          <w:left w:space="0" w:sz="0" w:val="nil"/>
+          <w:bottom w:space="0" w:sz="0" w:val="nil"/>
+          <w:right w:space="0" w:sz="0" w:val="nil"/>
+          <w:between w:space="0" w:sz="0" w:val="nil"/>
+        </w:pBdr>
+        <w:shd w:fill="auto" w:val="clear"/>
+        <w:spacing w:after="0" w:before="0" w:line="240" w:lineRule="auto"/>
+        <w:ind w:right="0"/>
+        <w:jc w:val="both"/>
+        <w:rPr>
+          <w:sz w:val="24"/>
+          <w:szCs w:val="24"/>
+        </w:rPr>
+      </w:pPr>
+      <w:r>
+        <w:rPr>
+          <w:rFonts w:ascii="Calibri" w:cs="Calibri" w:eastAsia="Calibri" w:hAnsi="Calibri"/>
+          <w:b w:val="0"/>
+          <w:i w:val="0"/>
+          <w:smallCaps w:val="0"/>
+          <w:strike w:val="0"/>
+          <w:color w:val="000000"/>
+          <w:sz w:val="24"/>
+          <w:szCs w:val="24"/>
+          <w:u w:val="none"/>
+          <w:shd w:fill="auto" w:val="clear"/>
+          <w:vertAlign w:val="baseline"/>
+          <w:rtl w:val="0"/>
+        </w:rPr>
+        <w:t xml:space="preserve">ЧП Azbuka.Ex, г. </w:t>
+      </w:r>
+      <w:r>
+        <w:rPr>
+          <w:sz w:val="24"/>
+          <w:szCs w:val="24"/>
+          <w:rtl w:val="0"/>
+        </w:rPr>
+        <w:t xml:space="preserve">Днепр.</w:t>
       </w:r>
     </w:p>
     <w:p>
@@ -3345,35 +3107,37 @@
         <w:shd w:fill="auto" w:val="clear"/>
         <w:spacing w:after="0" w:before="0" w:line="240" w:lineRule="auto"/>
         <w:ind w:left="720" w:right="0" w:hanging="360"/>
-        <w:jc w:val="left"/>
-        <w:rPr>
-          <w:b w:val="0"/>
-          <w:i w:val="0"/>
-          <w:smallCaps w:val="0"/>
-          <w:strike w:val="0"/>
-          <w:color w:val="000000"/>
-          <w:sz w:val="24"/>
-          <w:szCs w:val="24"/>
-          <w:highlight w:val="white"/>
-          <w:u w:val="none"/>
-        </w:rPr>
-      </w:pPr>
-      <w:r>
-        <w:rPr>
-          <w:rFonts w:ascii="Calibri" w:cs="Calibri" w:eastAsia="Calibri" w:hAnsi="Calibri"/>
-          <w:b w:val="0"/>
-          <w:i w:val="0"/>
-          <w:smallCaps w:val="0"/>
-          <w:strike w:val="0"/>
-          <w:color w:val="000000"/>
-          <w:sz w:val="24"/>
-          <w:szCs w:val="24"/>
-          <w:highlight w:val="white"/>
-          <w:u w:val="none"/>
-          <w:vertAlign w:val="baseline"/>
-          <w:rtl w:val="0"/>
-        </w:rPr>
-        <w:t xml:space="preserve">Комплексная техподдержка и работа по ликвидации вирусов и вредоносных программ.</w:t>
+        <w:jc w:val="both"/>
+        <w:rPr>
+          <w:sz w:val="24"/>
+          <w:szCs w:val="24"/>
+          <w:u w:val="none"/>
+        </w:rPr>
+      </w:pPr>
+      <w:r>
+        <w:rPr>
+          <w:rFonts w:ascii="Calibri" w:cs="Calibri" w:eastAsia="Calibri" w:hAnsi="Calibri"/>
+          <w:b w:val="0"/>
+          <w:i w:val="0"/>
+          <w:smallCaps w:val="0"/>
+          <w:strike w:val="0"/>
+          <w:color w:val="000000"/>
+          <w:sz w:val="24"/>
+          <w:szCs w:val="24"/>
+          <w:u w:val="none"/>
+          <w:shd w:fill="auto" w:val="clear"/>
+          <w:vertAlign w:val="baseline"/>
+          <w:rtl w:val="0"/>
+        </w:rPr>
+        <w:t xml:space="preserve">Администрирование серверов</w:t>
+      </w:r>
+      <w:r>
+        <w:rPr>
+          <w:sz w:val="24"/>
+          <w:szCs w:val="24"/>
+          <w:rtl w:val="0"/>
+        </w:rPr>
+        <w:t xml:space="preserve"> и веб сайтов, размещенных на серверах. </w:t>
       </w:r>
     </w:p>
     <w:p>
@@ -3405,191 +3169,17 @@
           <w:color w:val="000000"/>
           <w:sz w:val="24"/>
           <w:szCs w:val="24"/>
-          <w:highlight w:val="white"/>
-          <w:u w:val="none"/>
-        </w:rPr>
-      </w:pPr>
-      <w:r>
-        <w:rPr>
-          <w:rFonts w:ascii="Calibri" w:cs="Calibri" w:eastAsia="Calibri" w:hAnsi="Calibri"/>
-          <w:b w:val="0"/>
-          <w:i w:val="0"/>
-          <w:smallCaps w:val="0"/>
-          <w:strike w:val="0"/>
-          <w:color w:val="000000"/>
-          <w:sz w:val="24"/>
-          <w:szCs w:val="24"/>
-          <w:highlight w:val="white"/>
-          <w:u w:val="none"/>
-          <w:vertAlign w:val="baseline"/>
-          <w:rtl w:val="0"/>
-        </w:rPr>
-        <w:t xml:space="preserve">Подготовка и настройка рабочих мест для новых сотрудников компании.</w:t>
-      </w:r>
-    </w:p>
-    <w:p>
-      <w:pPr>
-        <w:keepNext w:val="0"/>
-        <w:keepLines w:val="0"/>
-        <w:pageBreakBefore w:val="0"/>
-        <w:widowControl w:val="1"/>
-        <w:pBdr>
-          <w:top w:space="0" w:sz="0" w:val="nil"/>
-          <w:left w:space="0" w:sz="0" w:val="nil"/>
-          <w:bottom w:space="0" w:sz="0" w:val="nil"/>
-          <w:right w:space="0" w:sz="0" w:val="nil"/>
-          <w:between w:space="0" w:sz="0" w:val="nil"/>
-        </w:pBdr>
-        <w:shd w:fill="auto" w:val="clear"/>
-        <w:spacing w:after="0" w:before="0" w:line="240" w:lineRule="auto"/>
-        <w:ind w:left="0" w:right="0" w:firstLine="0"/>
-        <w:jc w:val="left"/>
-        <w:rPr>
-          <w:rFonts w:ascii="Calibri" w:cs="Calibri" w:eastAsia="Calibri" w:hAnsi="Calibri"/>
-          <w:b w:val="0"/>
-          <w:i w:val="0"/>
-          <w:smallCaps w:val="0"/>
-          <w:strike w:val="0"/>
-          <w:color w:val="000000"/>
-          <w:sz w:val="24"/>
-          <w:szCs w:val="24"/>
-          <w:highlight w:val="white"/>
-          <w:u w:val="none"/>
-          <w:vertAlign w:val="baseline"/>
-        </w:rPr>
-      </w:pPr>
-      <w:r>
-        <w:rPr>
-          <w:rtl w:val="0"/>
-        </w:rPr>
-      </w:r>
-    </w:p>
-    <w:p>
-      <w:pPr>
-        <w:keepNext w:val="0"/>
-        <w:keepLines w:val="0"/>
-        <w:pageBreakBefore w:val="0"/>
-        <w:widowControl w:val="1"/>
-        <w:pBdr>
-          <w:top w:space="0" w:sz="0" w:val="nil"/>
-          <w:left w:space="0" w:sz="0" w:val="nil"/>
-          <w:bottom w:space="0" w:sz="0" w:val="nil"/>
-          <w:right w:space="0" w:sz="0" w:val="nil"/>
-          <w:between w:space="0" w:sz="0" w:val="nil"/>
-        </w:pBdr>
-        <w:shd w:fill="auto" w:val="clear"/>
-        <w:spacing w:after="0" w:before="0" w:line="240" w:lineRule="auto"/>
-        <w:ind w:left="0" w:right="0" w:firstLine="0"/>
-        <w:jc w:val="both"/>
-        <w:rPr>
-          <w:rFonts w:ascii="Calibri" w:cs="Calibri" w:eastAsia="Calibri" w:hAnsi="Calibri"/>
-          <w:b w:val="0"/>
-          <w:i w:val="0"/>
-          <w:smallCaps w:val="0"/>
-          <w:strike w:val="0"/>
-          <w:color w:val="000000"/>
-          <w:sz w:val="24"/>
-          <w:szCs w:val="24"/>
-          <w:u w:val="none"/>
-          <w:shd w:fill="auto" w:val="clear"/>
-          <w:vertAlign w:val="baseline"/>
-        </w:rPr>
-      </w:pPr>
-      <w:r>
-        <w:rPr>
-          <w:rFonts w:ascii="Calibri" w:cs="Calibri" w:eastAsia="Calibri" w:hAnsi="Calibri"/>
-          <w:b w:val="1"/>
-          <w:i w:val="0"/>
-          <w:smallCaps w:val="0"/>
-          <w:strike w:val="0"/>
-          <w:color w:val="000000"/>
-          <w:sz w:val="24"/>
-          <w:szCs w:val="24"/>
-          <w:u w:val="none"/>
-          <w:shd w:fill="auto" w:val="clear"/>
-          <w:vertAlign w:val="baseline"/>
-          <w:rtl w:val="0"/>
-        </w:rPr>
-        <w:t xml:space="preserve">2014 – 2018</w:t>
-      </w:r>
-      <w:r>
-        <w:rPr>
-          <w:rFonts w:ascii="Calibri" w:cs="Calibri" w:eastAsia="Calibri" w:hAnsi="Calibri"/>
-          <w:b w:val="0"/>
-          <w:i w:val="0"/>
-          <w:smallCaps w:val="0"/>
-          <w:strike w:val="0"/>
-          <w:color w:val="000000"/>
-          <w:sz w:val="24"/>
-          <w:szCs w:val="24"/>
-          <w:u w:val="none"/>
-          <w:shd w:fill="auto" w:val="clear"/>
-          <w:vertAlign w:val="baseline"/>
-          <w:rtl w:val="0"/>
-        </w:rPr>
-        <w:t xml:space="preserve"> Фронтенд разработчик</w:t>
-      </w:r>
-    </w:p>
-    <w:p>
-      <w:pPr>
-        <w:keepNext w:val="0"/>
-        <w:keepLines w:val="0"/>
-        <w:pageBreakBefore w:val="0"/>
-        <w:widowControl w:val="1"/>
-        <w:pBdr>
-          <w:top w:space="0" w:sz="0" w:val="nil"/>
-          <w:left w:space="0" w:sz="0" w:val="nil"/>
-          <w:bottom w:space="0" w:sz="0" w:val="nil"/>
-          <w:right w:space="0" w:sz="0" w:val="nil"/>
-          <w:between w:space="0" w:sz="0" w:val="nil"/>
-        </w:pBdr>
-        <w:shd w:fill="auto" w:val="clear"/>
-        <w:spacing w:after="0" w:before="0" w:line="240" w:lineRule="auto"/>
-        <w:ind w:left="0" w:right="0" w:firstLine="0"/>
-        <w:jc w:val="both"/>
-        <w:rPr>
-          <w:rFonts w:ascii="Calibri" w:cs="Calibri" w:eastAsia="Calibri" w:hAnsi="Calibri"/>
-          <w:b w:val="0"/>
-          <w:i w:val="0"/>
-          <w:smallCaps w:val="0"/>
-          <w:strike w:val="0"/>
-          <w:color w:val="000000"/>
-          <w:sz w:val="24"/>
-          <w:szCs w:val="24"/>
-          <w:u w:val="none"/>
-          <w:shd w:fill="auto" w:val="clear"/>
-          <w:vertAlign w:val="baseline"/>
-        </w:rPr>
-      </w:pPr>
-      <w:r>
-        <w:rPr>
-          <w:rFonts w:ascii="Calibri" w:cs="Calibri" w:eastAsia="Calibri" w:hAnsi="Calibri"/>
-          <w:b w:val="0"/>
-          <w:i w:val="0"/>
-          <w:smallCaps w:val="0"/>
-          <w:strike w:val="0"/>
-          <w:color w:val="000000"/>
-          <w:sz w:val="24"/>
-          <w:szCs w:val="24"/>
-          <w:u w:val="none"/>
-          <w:shd w:fill="auto" w:val="clear"/>
-          <w:vertAlign w:val="baseline"/>
-          <w:rtl w:val="0"/>
-        </w:rPr>
-        <w:t xml:space="preserve">Биржа фриланс, г. </w:t>
-      </w:r>
-      <w:r>
-        <w:rPr>
-          <w:sz w:val="24"/>
-          <w:szCs w:val="24"/>
-          <w:rtl w:val="0"/>
-        </w:rPr>
-        <w:t xml:space="preserve">Днепр</w:t>
-      </w:r>
-      <w:r>
-        <w:rPr>
-          <w:rtl w:val="0"/>
-        </w:rPr>
+          <w:u w:val="none"/>
+          <w:shd w:fill="auto" w:val="clear"/>
+        </w:rPr>
+      </w:pPr>
+      <w:r>
+        <w:rPr>
+          <w:sz w:val="24"/>
+          <w:szCs w:val="24"/>
+          <w:rtl w:val="0"/>
+        </w:rPr>
+        <w:t xml:space="preserve">Создание автоматизированного процесса сборки и развертывания приложения, реинжиниринг настройки для улучшения взаимодействия с пользователем и создание системы непрерывной интеграции. </w:t>
       </w:r>
     </w:p>
     <w:p>
@@ -3610,7 +3200,7 @@
           <w:between w:space="0" w:sz="0" w:val="nil"/>
         </w:pBdr>
         <w:shd w:fill="auto" w:val="clear"/>
-        <w:spacing w:after="0" w:before="280" w:line="240" w:lineRule="auto"/>
+        <w:spacing w:after="0" w:before="0" w:line="240" w:lineRule="auto"/>
         <w:ind w:left="720" w:right="0" w:hanging="360"/>
         <w:jc w:val="left"/>
         <w:rPr>
@@ -3640,420 +3230,7 @@
           <w:vertAlign w:val="baseline"/>
           <w:rtl w:val="0"/>
         </w:rPr>
-        <w:t xml:space="preserve">Выполнение заказов по созданию дизайна веб сайтов.</w:t>
-      </w:r>
-    </w:p>
-    <w:p>
-      <w:pPr>
-        <w:keepNext w:val="0"/>
-        <w:keepLines w:val="0"/>
-        <w:pageBreakBefore w:val="0"/>
-        <w:widowControl w:val="1"/>
-        <w:numPr>
-          <w:ilvl w:val="0"/>
-          <w:numId w:val="1"/>
-        </w:numPr>
-        <w:pBdr>
-          <w:top w:space="0" w:sz="0" w:val="nil"/>
-          <w:left w:space="0" w:sz="0" w:val="nil"/>
-          <w:bottom w:space="0" w:sz="0" w:val="nil"/>
-          <w:right w:space="0" w:sz="0" w:val="nil"/>
-          <w:between w:space="0" w:sz="0" w:val="nil"/>
-        </w:pBdr>
-        <w:shd w:fill="auto" w:val="clear"/>
-        <w:spacing w:after="0" w:before="0" w:line="240" w:lineRule="auto"/>
-        <w:ind w:left="720" w:right="0" w:hanging="360"/>
-        <w:jc w:val="left"/>
-        <w:rPr>
-          <w:b w:val="0"/>
-          <w:i w:val="0"/>
-          <w:smallCaps w:val="0"/>
-          <w:strike w:val="0"/>
-          <w:color w:val="000000"/>
-          <w:sz w:val="24"/>
-          <w:szCs w:val="24"/>
-          <w:u w:val="none"/>
-          <w:shd w:fill="auto" w:val="clear"/>
-        </w:rPr>
-      </w:pPr>
-      <w:r>
-        <w:rPr>
-          <w:rFonts w:ascii="Calibri" w:cs="Calibri" w:eastAsia="Calibri" w:hAnsi="Calibri"/>
-          <w:b w:val="0"/>
-          <w:i w:val="0"/>
-          <w:smallCaps w:val="0"/>
-          <w:strike w:val="0"/>
-          <w:color w:val="000000"/>
-          <w:sz w:val="24"/>
-          <w:szCs w:val="24"/>
-          <w:u w:val="none"/>
-          <w:shd w:fill="auto" w:val="clear"/>
-          <w:vertAlign w:val="baseline"/>
-          <w:rtl w:val="0"/>
-        </w:rPr>
-        <w:t xml:space="preserve">Выполнение заказов по HTML верстке дизайна.</w:t>
-      </w:r>
-    </w:p>
-    <w:p>
-      <w:pPr>
-        <w:keepNext w:val="0"/>
-        <w:keepLines w:val="0"/>
-        <w:pageBreakBefore w:val="0"/>
-        <w:widowControl w:val="1"/>
-        <w:numPr>
-          <w:ilvl w:val="0"/>
-          <w:numId w:val="1"/>
-        </w:numPr>
-        <w:pBdr>
-          <w:top w:space="0" w:sz="0" w:val="nil"/>
-          <w:left w:space="0" w:sz="0" w:val="nil"/>
-          <w:bottom w:space="0" w:sz="0" w:val="nil"/>
-          <w:right w:space="0" w:sz="0" w:val="nil"/>
-          <w:between w:space="0" w:sz="0" w:val="nil"/>
-        </w:pBdr>
-        <w:shd w:fill="auto" w:val="clear"/>
-        <w:spacing w:after="0" w:before="0" w:line="240" w:lineRule="auto"/>
-        <w:ind w:left="720" w:right="0" w:hanging="360"/>
-        <w:jc w:val="left"/>
-        <w:rPr>
-          <w:b w:val="0"/>
-          <w:i w:val="0"/>
-          <w:smallCaps w:val="0"/>
-          <w:strike w:val="0"/>
-          <w:color w:val="000000"/>
-          <w:sz w:val="24"/>
-          <w:szCs w:val="24"/>
-          <w:u w:val="none"/>
-          <w:shd w:fill="auto" w:val="clear"/>
-        </w:rPr>
-      </w:pPr>
-      <w:r>
-        <w:rPr>
-          <w:rFonts w:ascii="Calibri" w:cs="Calibri" w:eastAsia="Calibri" w:hAnsi="Calibri"/>
-          <w:b w:val="0"/>
-          <w:i w:val="0"/>
-          <w:smallCaps w:val="0"/>
-          <w:strike w:val="0"/>
-          <w:color w:val="000000"/>
-          <w:sz w:val="24"/>
-          <w:szCs w:val="24"/>
-          <w:u w:val="none"/>
-          <w:shd w:fill="auto" w:val="clear"/>
-          <w:vertAlign w:val="baseline"/>
-          <w:rtl w:val="0"/>
-        </w:rPr>
-        <w:t xml:space="preserve">Адаптивная верстка.</w:t>
-      </w:r>
-    </w:p>
-    <w:p>
-      <w:pPr>
-        <w:keepNext w:val="0"/>
-        <w:keepLines w:val="0"/>
-        <w:pageBreakBefore w:val="0"/>
-        <w:widowControl w:val="1"/>
-        <w:numPr>
-          <w:ilvl w:val="0"/>
-          <w:numId w:val="1"/>
-        </w:numPr>
-        <w:pBdr>
-          <w:top w:space="0" w:sz="0" w:val="nil"/>
-          <w:left w:space="0" w:sz="0" w:val="nil"/>
-          <w:bottom w:space="0" w:sz="0" w:val="nil"/>
-          <w:right w:space="0" w:sz="0" w:val="nil"/>
-          <w:between w:space="0" w:sz="0" w:val="nil"/>
-        </w:pBdr>
-        <w:shd w:fill="auto" w:val="clear"/>
-        <w:spacing w:after="280" w:before="0" w:line="240" w:lineRule="auto"/>
-        <w:ind w:left="720" w:right="0" w:hanging="360"/>
-        <w:jc w:val="left"/>
-        <w:rPr>
-          <w:b w:val="0"/>
-          <w:i w:val="0"/>
-          <w:smallCaps w:val="0"/>
-          <w:strike w:val="0"/>
-          <w:color w:val="000000"/>
-          <w:sz w:val="24"/>
-          <w:szCs w:val="24"/>
-          <w:u w:val="none"/>
-          <w:shd w:fill="auto" w:val="clear"/>
-        </w:rPr>
-      </w:pPr>
-      <w:r>
-        <w:rPr>
-          <w:rFonts w:ascii="Calibri" w:cs="Calibri" w:eastAsia="Calibri" w:hAnsi="Calibri"/>
-          <w:b w:val="0"/>
-          <w:i w:val="0"/>
-          <w:smallCaps w:val="0"/>
-          <w:strike w:val="0"/>
-          <w:color w:val="000000"/>
-          <w:sz w:val="24"/>
-          <w:szCs w:val="24"/>
-          <w:u w:val="none"/>
-          <w:shd w:fill="auto" w:val="clear"/>
-          <w:vertAlign w:val="baseline"/>
-          <w:rtl w:val="0"/>
-        </w:rPr>
-        <w:t xml:space="preserve">Интеграция в CMS;</w:t>
-      </w:r>
-    </w:p>
-    <w:p>
-      <w:pPr>
-        <w:keepNext w:val="0"/>
-        <w:keepLines w:val="0"/>
-        <w:pageBreakBefore w:val="0"/>
-        <w:widowControl w:val="1"/>
-        <w:pBdr>
-          <w:top w:space="0" w:sz="0" w:val="nil"/>
-          <w:left w:space="0" w:sz="0" w:val="nil"/>
-          <w:bottom w:space="0" w:sz="0" w:val="nil"/>
-          <w:right w:space="0" w:sz="0" w:val="nil"/>
-          <w:between w:space="0" w:sz="0" w:val="nil"/>
-        </w:pBdr>
-        <w:shd w:fill="auto" w:val="clear"/>
-        <w:spacing w:after="0" w:before="0" w:line="240" w:lineRule="auto"/>
-        <w:ind w:left="0" w:right="0" w:firstLine="0"/>
-        <w:jc w:val="both"/>
-        <w:rPr>
-          <w:rFonts w:ascii="Calibri" w:cs="Calibri" w:eastAsia="Calibri" w:hAnsi="Calibri"/>
-          <w:b w:val="0"/>
-          <w:i w:val="0"/>
-          <w:smallCaps w:val="0"/>
-          <w:strike w:val="0"/>
-          <w:color w:val="000000"/>
-          <w:sz w:val="24"/>
-          <w:szCs w:val="24"/>
-          <w:u w:val="none"/>
-          <w:shd w:fill="auto" w:val="clear"/>
-          <w:vertAlign w:val="baseline"/>
-        </w:rPr>
-      </w:pPr>
-      <w:r>
-        <w:rPr>
-          <w:b w:val="1"/>
-          <w:sz w:val="24"/>
-          <w:szCs w:val="24"/>
-          <w:rtl w:val="0"/>
-        </w:rPr>
-        <w:t xml:space="preserve">2018 – 2022 IT - специалист </w:t>
-      </w:r>
-      <w:r>
-        <w:rPr>
-          <w:rtl w:val="0"/>
-        </w:rPr>
-      </w:r>
-    </w:p>
-    <w:p>
-      <w:pPr>
-        <w:keepNext w:val="0"/>
-        <w:keepLines w:val="0"/>
-        <w:pageBreakBefore w:val="0"/>
-        <w:widowControl w:val="1"/>
-        <w:pBdr>
-          <w:top w:space="0" w:sz="0" w:val="nil"/>
-          <w:left w:space="0" w:sz="0" w:val="nil"/>
-          <w:bottom w:space="0" w:sz="0" w:val="nil"/>
-          <w:right w:space="0" w:sz="0" w:val="nil"/>
-          <w:between w:space="0" w:sz="0" w:val="nil"/>
-        </w:pBdr>
-        <w:shd w:fill="auto" w:val="clear"/>
-        <w:spacing w:after="0" w:before="0" w:line="240" w:lineRule="auto"/>
-        <w:ind w:left="0" w:right="0" w:firstLine="0"/>
-        <w:jc w:val="both"/>
-        <w:rPr>
-          <w:rFonts w:ascii="Calibri" w:cs="Calibri" w:eastAsia="Calibri" w:hAnsi="Calibri"/>
-          <w:b w:val="0"/>
-          <w:i w:val="0"/>
-          <w:smallCaps w:val="0"/>
-          <w:strike w:val="0"/>
-          <w:color w:val="000000"/>
-          <w:sz w:val="24"/>
-          <w:szCs w:val="24"/>
-          <w:u w:val="none"/>
-          <w:shd w:fill="auto" w:val="clear"/>
-          <w:vertAlign w:val="baseline"/>
-        </w:rPr>
-      </w:pPr>
-      <w:r>
-        <w:rPr>
-          <w:rFonts w:ascii="Calibri" w:cs="Calibri" w:eastAsia="Calibri" w:hAnsi="Calibri"/>
-          <w:b w:val="0"/>
-          <w:i w:val="0"/>
-          <w:smallCaps w:val="0"/>
-          <w:strike w:val="0"/>
-          <w:color w:val="000000"/>
-          <w:sz w:val="24"/>
-          <w:szCs w:val="24"/>
-          <w:u w:val="none"/>
-          <w:shd w:fill="auto" w:val="clear"/>
-          <w:vertAlign w:val="baseline"/>
-          <w:rtl w:val="0"/>
-        </w:rPr>
-        <w:t xml:space="preserve">ЧП Azbuka.Ex, г. </w:t>
-      </w:r>
-      <w:r>
-        <w:rPr>
-          <w:sz w:val="24"/>
-          <w:szCs w:val="24"/>
-          <w:rtl w:val="0"/>
-        </w:rPr>
-        <w:t xml:space="preserve">Днепр</w:t>
-      </w:r>
-      <w:r>
-        <w:rPr>
-          <w:rtl w:val="0"/>
-        </w:rPr>
-      </w:r>
-    </w:p>
-    <w:p>
-      <w:pPr>
-        <w:keepNext w:val="0"/>
-        <w:keepLines w:val="0"/>
-        <w:pageBreakBefore w:val="0"/>
-        <w:widowControl w:val="1"/>
-        <w:numPr>
-          <w:ilvl w:val="0"/>
-          <w:numId w:val="1"/>
-        </w:numPr>
-        <w:pBdr>
-          <w:top w:space="0" w:sz="0" w:val="nil"/>
-          <w:left w:space="0" w:sz="0" w:val="nil"/>
-          <w:bottom w:space="0" w:sz="0" w:val="nil"/>
-          <w:right w:space="0" w:sz="0" w:val="nil"/>
-          <w:between w:space="0" w:sz="0" w:val="nil"/>
-        </w:pBdr>
-        <w:shd w:fill="auto" w:val="clear"/>
-        <w:spacing w:after="0" w:before="280" w:line="240" w:lineRule="auto"/>
-        <w:ind w:left="720" w:right="0" w:hanging="360"/>
-        <w:jc w:val="left"/>
-        <w:rPr>
-          <w:b w:val="0"/>
-          <w:i w:val="0"/>
-          <w:smallCaps w:val="0"/>
-          <w:strike w:val="0"/>
-          <w:color w:val="000000"/>
-          <w:sz w:val="24"/>
-          <w:szCs w:val="24"/>
-          <w:u w:val="none"/>
-          <w:shd w:fill="auto" w:val="clear"/>
-        </w:rPr>
-      </w:pPr>
-      <w:r>
-        <w:rPr>
-          <w:rFonts w:ascii="Calibri" w:cs="Calibri" w:eastAsia="Calibri" w:hAnsi="Calibri"/>
-          <w:b w:val="0"/>
-          <w:i w:val="0"/>
-          <w:smallCaps w:val="0"/>
-          <w:strike w:val="0"/>
-          <w:color w:val="000000"/>
-          <w:sz w:val="24"/>
-          <w:szCs w:val="24"/>
-          <w:u w:val="none"/>
-          <w:shd w:fill="auto" w:val="clear"/>
-          <w:vertAlign w:val="baseline"/>
-          <w:rtl w:val="0"/>
-        </w:rPr>
-        <w:t xml:space="preserve">Администрирование серверов. </w:t>
-      </w:r>
-      <w:r>
-        <w:rPr>
-          <w:sz w:val="24"/>
-          <w:szCs w:val="24"/>
-          <w:rtl w:val="0"/>
-        </w:rPr>
-        <w:t xml:space="preserve">Администрирование веб сайтов, размещенных на серверах. </w:t>
-      </w:r>
-    </w:p>
-    <w:p>
-      <w:pPr>
-        <w:keepNext w:val="0"/>
-        <w:keepLines w:val="0"/>
-        <w:pageBreakBefore w:val="0"/>
-        <w:widowControl w:val="1"/>
-        <w:numPr>
-          <w:ilvl w:val="0"/>
-          <w:numId w:val="1"/>
-        </w:numPr>
-        <w:pBdr>
-          <w:top w:space="0" w:sz="0" w:val="nil"/>
-          <w:left w:space="0" w:sz="0" w:val="nil"/>
-          <w:bottom w:space="0" w:sz="0" w:val="nil"/>
-          <w:right w:space="0" w:sz="0" w:val="nil"/>
-          <w:between w:space="0" w:sz="0" w:val="nil"/>
-        </w:pBdr>
-        <w:shd w:fill="auto" w:val="clear"/>
-        <w:spacing w:after="0" w:before="0" w:line="240" w:lineRule="auto"/>
-        <w:ind w:left="720" w:right="0" w:hanging="360"/>
-        <w:jc w:val="left"/>
-        <w:rPr>
-          <w:b w:val="0"/>
-          <w:i w:val="0"/>
-          <w:smallCaps w:val="0"/>
-          <w:strike w:val="0"/>
-          <w:color w:val="000000"/>
-          <w:sz w:val="24"/>
-          <w:szCs w:val="24"/>
-          <w:u w:val="none"/>
-          <w:shd w:fill="auto" w:val="clear"/>
-        </w:rPr>
-      </w:pPr>
-      <w:r>
-        <w:rPr>
-          <w:sz w:val="24"/>
-          <w:szCs w:val="24"/>
-          <w:rtl w:val="0"/>
-        </w:rPr>
-        <w:t xml:space="preserve">Создание автоматизированного процесса сборки и развертывания приложения, реинжиниринг настройки для улучшения взаимодействия с пользователем и создание системы непрерывной интеграции. </w:t>
-      </w:r>
-    </w:p>
-    <w:p>
-      <w:pPr>
-        <w:keepNext w:val="0"/>
-        <w:keepLines w:val="0"/>
-        <w:pageBreakBefore w:val="0"/>
-        <w:widowControl w:val="1"/>
-        <w:numPr>
-          <w:ilvl w:val="0"/>
-          <w:numId w:val="1"/>
-        </w:numPr>
-        <w:pBdr>
-          <w:top w:space="0" w:sz="0" w:val="nil"/>
-          <w:left w:space="0" w:sz="0" w:val="nil"/>
-          <w:bottom w:space="0" w:sz="0" w:val="nil"/>
-          <w:right w:space="0" w:sz="0" w:val="nil"/>
-          <w:between w:space="0" w:sz="0" w:val="nil"/>
-        </w:pBdr>
-        <w:shd w:fill="auto" w:val="clear"/>
-        <w:spacing w:after="0" w:before="0" w:line="240" w:lineRule="auto"/>
-        <w:ind w:left="720" w:right="0" w:hanging="360"/>
-        <w:jc w:val="left"/>
-        <w:rPr>
-          <w:b w:val="0"/>
-          <w:i w:val="0"/>
-          <w:smallCaps w:val="0"/>
-          <w:strike w:val="0"/>
-          <w:color w:val="000000"/>
-          <w:sz w:val="24"/>
-          <w:szCs w:val="24"/>
-          <w:u w:val="none"/>
-          <w:shd w:fill="auto" w:val="clear"/>
-        </w:rPr>
-      </w:pPr>
-      <w:r>
-        <w:rPr>
-          <w:rFonts w:ascii="Calibri" w:cs="Calibri" w:eastAsia="Calibri" w:hAnsi="Calibri"/>
-          <w:b w:val="0"/>
-          <w:i w:val="0"/>
-          <w:smallCaps w:val="0"/>
-          <w:strike w:val="0"/>
-          <w:color w:val="000000"/>
-          <w:sz w:val="24"/>
-          <w:szCs w:val="24"/>
-          <w:u w:val="none"/>
-          <w:shd w:fill="auto" w:val="clear"/>
-          <w:vertAlign w:val="baseline"/>
-          <w:rtl w:val="0"/>
-        </w:rPr>
-        <w:t xml:space="preserve">Поддержание активности веб платформ и веб приложений. Обновление дизайна сайтов, SEO оптимизация, реклама</w:t>
+        <w:t xml:space="preserve">Поддержание активности веб платформ и веб приложений. Обновление дизайна сайтов</w:t>
       </w:r>
       <w:r>
         <w:rPr>
@@ -4123,122 +3300,24 @@
         </w:rPr>
         <w:t xml:space="preserve">Руководство командой для поддержания активности веб сайтов и веб приложений.</w:t>
       </w:r>
-    </w:p>
-    <w:p>
-      <w:pPr>
-        <w:keepNext w:val="0"/>
-        <w:keepLines w:val="0"/>
-        <w:pageBreakBefore w:val="0"/>
-        <w:widowControl w:val="1"/>
+      <w:r>
+        <w:rPr>
+          <w:rtl w:val="0"/>
+        </w:rPr>
+      </w:r>
+    </w:p>
+    <w:p>
+      <w:pPr>
         <w:numPr>
           <w:ilvl w:val="0"/>
           <w:numId w:val="1"/>
         </w:numPr>
-        <w:pBdr>
-          <w:top w:space="0" w:sz="0" w:val="nil"/>
-          <w:left w:space="0" w:sz="0" w:val="nil"/>
-          <w:bottom w:space="0" w:sz="0" w:val="nil"/>
-          <w:right w:space="0" w:sz="0" w:val="nil"/>
-          <w:between w:space="0" w:sz="0" w:val="nil"/>
-        </w:pBdr>
-        <w:shd w:fill="auto" w:val="clear"/>
-        <w:spacing w:after="0" w:before="0" w:line="240" w:lineRule="auto"/>
-        <w:ind w:left="720" w:right="0" w:hanging="360"/>
-        <w:jc w:val="left"/>
-        <w:rPr>
-          <w:b w:val="0"/>
-          <w:i w:val="0"/>
-          <w:smallCaps w:val="0"/>
-          <w:strike w:val="0"/>
-          <w:color w:val="000000"/>
-          <w:sz w:val="24"/>
-          <w:szCs w:val="24"/>
-          <w:u w:val="none"/>
-          <w:shd w:fill="auto" w:val="clear"/>
-        </w:rPr>
-      </w:pPr>
-      <w:r>
-        <w:rPr>
-          <w:rFonts w:ascii="Calibri" w:cs="Calibri" w:eastAsia="Calibri" w:hAnsi="Calibri"/>
-          <w:b w:val="0"/>
-          <w:i w:val="0"/>
-          <w:smallCaps w:val="0"/>
-          <w:strike w:val="0"/>
-          <w:color w:val="000000"/>
-          <w:sz w:val="24"/>
-          <w:szCs w:val="24"/>
-          <w:u w:val="none"/>
-          <w:shd w:fill="auto" w:val="clear"/>
-          <w:vertAlign w:val="baseline"/>
-          <w:rtl w:val="0"/>
-        </w:rPr>
-        <w:t xml:space="preserve">Администрирование веб-портала предоставляющего услуги </w:t>
-      </w:r>
-      <w:r>
-        <w:rPr>
-          <w:sz w:val="24"/>
-          <w:szCs w:val="24"/>
-          <w:rtl w:val="0"/>
-        </w:rPr>
-        <w:t xml:space="preserve">обменника</w:t>
-      </w:r>
-      <w:r>
-        <w:rPr>
-          <w:rFonts w:ascii="Calibri" w:cs="Calibri" w:eastAsia="Calibri" w:hAnsi="Calibri"/>
-          <w:b w:val="0"/>
-          <w:i w:val="0"/>
-          <w:smallCaps w:val="0"/>
-          <w:strike w:val="0"/>
-          <w:color w:val="000000"/>
-          <w:sz w:val="24"/>
-          <w:szCs w:val="24"/>
-          <w:u w:val="none"/>
-          <w:shd w:fill="auto" w:val="clear"/>
-          <w:vertAlign w:val="baseline"/>
-          <w:rtl w:val="0"/>
-        </w:rPr>
-        <w:t xml:space="preserve"> электронных валют</w:t>
-      </w:r>
-      <w:r>
-        <w:rPr>
-          <w:sz w:val="24"/>
-          <w:szCs w:val="24"/>
-          <w:rtl w:val="0"/>
-        </w:rPr>
-        <w:t xml:space="preserve">.</w:t>
-      </w:r>
-    </w:p>
-    <w:p>
-      <w:pPr>
-        <w:keepNext w:val="0"/>
-        <w:keepLines w:val="0"/>
-        <w:pageBreakBefore w:val="0"/>
-        <w:widowControl w:val="1"/>
-        <w:numPr>
-          <w:ilvl w:val="0"/>
-          <w:numId w:val="1"/>
-        </w:numPr>
-        <w:pBdr>
-          <w:top w:space="0" w:sz="0" w:val="nil"/>
-          <w:left w:space="0" w:sz="0" w:val="nil"/>
-          <w:bottom w:space="0" w:sz="0" w:val="nil"/>
-          <w:right w:space="0" w:sz="0" w:val="nil"/>
-          <w:between w:space="0" w:sz="0" w:val="nil"/>
-        </w:pBdr>
-        <w:shd w:fill="auto" w:val="clear"/>
-        <w:spacing w:after="0" w:before="0" w:line="240" w:lineRule="auto"/>
-        <w:ind w:left="720" w:right="0" w:hanging="360"/>
-        <w:jc w:val="left"/>
-        <w:rPr>
-          <w:b w:val="0"/>
-          <w:i w:val="0"/>
-          <w:smallCaps w:val="0"/>
-          <w:strike w:val="0"/>
-          <w:color w:val="000000"/>
-          <w:sz w:val="24"/>
-          <w:szCs w:val="24"/>
-          <w:u w:val="none"/>
-          <w:shd w:fill="auto" w:val="clear"/>
+        <w:spacing w:after="280" w:lineRule="auto"/>
+        <w:ind w:left="720" w:hanging="360"/>
+        <w:rPr>
+          <w:sz w:val="24"/>
+          <w:szCs w:val="24"/>
+          <w:u w:val="none"/>
         </w:rPr>
       </w:pPr>
       <w:r>
@@ -4306,83 +3385,6 @@
           <w:between w:space="0" w:sz="0" w:val="nil"/>
         </w:pBdr>
         <w:shd w:fill="auto" w:val="clear"/>
-        <w:spacing w:after="280" w:before="0" w:line="240" w:lineRule="auto"/>
-        <w:ind w:left="720" w:right="0" w:firstLine="0"/>
-        <w:jc w:val="left"/>
-        <w:rPr>
-          <w:sz w:val="24"/>
-          <w:szCs w:val="24"/>
-        </w:rPr>
-      </w:pPr>
-      <w:r>
-        <w:rPr>
-          <w:rtl w:val="0"/>
-        </w:rPr>
-      </w:r>
-    </w:p>
-    <w:p>
-      <w:pPr>
-        <w:keepNext w:val="0"/>
-        <w:keepLines w:val="0"/>
-        <w:pageBreakBefore w:val="0"/>
-        <w:widowControl w:val="1"/>
-        <w:pBdr>
-          <w:top w:space="0" w:sz="0" w:val="nil"/>
-          <w:left w:space="0" w:sz="0" w:val="nil"/>
-          <w:bottom w:space="0" w:sz="0" w:val="nil"/>
-          <w:right w:space="0" w:sz="0" w:val="nil"/>
-          <w:between w:space="0" w:sz="0" w:val="nil"/>
-        </w:pBdr>
-        <w:shd w:fill="auto" w:val="clear"/>
-        <w:spacing w:after="280" w:before="280" w:line="240" w:lineRule="auto"/>
-        <w:ind w:left="720" w:right="0" w:firstLine="0"/>
-        <w:jc w:val="left"/>
-        <w:rPr>
-          <w:rFonts w:ascii="Calibri" w:cs="Calibri" w:eastAsia="Calibri" w:hAnsi="Calibri"/>
-          <w:b w:val="0"/>
-          <w:i w:val="0"/>
-          <w:smallCaps w:val="0"/>
-          <w:strike w:val="0"/>
-          <w:color w:val="000000"/>
-          <w:sz w:val="24"/>
-          <w:szCs w:val="24"/>
-          <w:u w:val="none"/>
-          <w:shd w:fill="auto" w:val="clear"/>
-          <w:vertAlign w:val="baseline"/>
-        </w:rPr>
-      </w:pPr>
-      <w:r>
-        <w:rPr>
-          <w:rFonts w:ascii="Calibri" w:cs="Calibri" w:eastAsia="Calibri" w:hAnsi="Calibri"/>
-          <w:b w:val="0"/>
-          <w:i w:val="0"/>
-          <w:smallCaps w:val="0"/>
-          <w:strike w:val="0"/>
-          <w:color w:val="000000"/>
-          <w:sz w:val="24"/>
-          <w:szCs w:val="24"/>
-          <w:u w:val="none"/>
-          <w:shd w:fill="auto" w:val="clear"/>
-          <w:vertAlign w:val="baseline"/>
-          <w:rtl w:val="0"/>
-        </w:rPr>
-        <w:br w:type="textWrapping"/>
-      </w:r>
-    </w:p>
-    <w:p>
-      <w:pPr>
-        <w:keepNext w:val="0"/>
-        <w:keepLines w:val="0"/>
-        <w:pageBreakBefore w:val="0"/>
-        <w:widowControl w:val="1"/>
-        <w:pBdr>
-          <w:top w:space="0" w:sz="0" w:val="nil"/>
-          <w:left w:space="0" w:sz="0" w:val="nil"/>
-          <w:bottom w:space="0" w:sz="0" w:val="nil"/>
-          <w:right w:space="0" w:sz="0" w:val="nil"/>
-          <w:between w:space="0" w:sz="0" w:val="nil"/>
-        </w:pBdr>
-        <w:shd w:fill="auto" w:val="clear"/>
         <w:spacing w:after="0" w:before="0" w:line="240" w:lineRule="auto"/>
         <w:ind w:left="0" w:right="0" w:firstLine="0"/>
         <w:jc w:val="left"/>
@@ -4408,14 +3410,31 @@
           <w:smallCaps w:val="0"/>
           <w:strike w:val="0"/>
           <w:color w:val="000000"/>
-          <w:sz w:val="24"/>
-          <w:szCs w:val="24"/>
-          <w:u w:val="none"/>
-          <w:shd w:fill="auto" w:val="clear"/>
-          <w:vertAlign w:val="baseline"/>
-          <w:rtl w:val="0"/>
-        </w:rPr>
-        <w:t xml:space="preserve">Образование:</w:t>
+          <w:sz w:val="28"/>
+          <w:szCs w:val="28"/>
+          <w:u w:val="none"/>
+          <w:shd w:fill="auto" w:val="clear"/>
+          <w:vertAlign w:val="baseline"/>
+          <w:rtl w:val="0"/>
+        </w:rPr>
+        <w:t xml:space="preserve">Образование</w:t>
+      </w:r>
+      <w:r>
+        <w:rPr>
+          <w:rFonts w:ascii="Calibri" w:cs="Calibri" w:eastAsia="Calibri" w:hAnsi="Calibri"/>
+          <w:b w:val="1"/>
+          <w:i w:val="0"/>
+          <w:smallCaps w:val="0"/>
+          <w:strike w:val="0"/>
+          <w:color w:val="000000"/>
+          <w:sz w:val="24"/>
+          <w:szCs w:val="24"/>
+          <w:u w:val="none"/>
+          <w:shd w:fill="auto" w:val="clear"/>
+          <w:vertAlign w:val="baseline"/>
+          <w:rtl w:val="0"/>
+        </w:rPr>
+        <w:t xml:space="preserve">:</w:t>
       </w:r>
       <w:r>
         <w:rPr>
@@ -4727,8 +3746,8 @@
           <w:smallCaps w:val="0"/>
           <w:strike w:val="0"/>
           <w:color w:val="000000"/>
-          <w:sz w:val="24"/>
-          <w:szCs w:val="24"/>
+          <w:sz w:val="28"/>
+          <w:szCs w:val="28"/>
           <w:u w:val="none"/>
           <w:shd w:fill="auto" w:val="clear"/>
           <w:vertAlign w:val="baseline"/>
@@ -4742,8 +3761,8 @@
           <w:smallCaps w:val="0"/>
           <w:strike w:val="0"/>
           <w:color w:val="000000"/>
-          <w:sz w:val="24"/>
-          <w:szCs w:val="24"/>
+          <w:sz w:val="28"/>
+          <w:szCs w:val="28"/>
           <w:u w:val="none"/>
           <w:shd w:fill="auto" w:val="clear"/>
           <w:vertAlign w:val="baseline"/>
@@ -4775,17 +3794,8 @@
         <w:ind w:left="0" w:right="0" w:firstLine="0"/>
         <w:jc w:val="left"/>
         <w:rPr>
-          <w:rFonts w:ascii="Calibri" w:cs="Calibri" w:eastAsia="Calibri" w:hAnsi="Calibri"/>
-          <w:b w:val="0"/>
-          <w:i w:val="0"/>
-          <w:smallCaps w:val="0"/>
-          <w:strike w:val="0"/>
-          <w:color w:val="000000"/>
-          <w:sz w:val="24"/>
-          <w:szCs w:val="24"/>
-          <w:u w:val="none"/>
-          <w:shd w:fill="auto" w:val="clear"/>
-          <w:vertAlign w:val="baseline"/>
+          <w:sz w:val="24"/>
+          <w:szCs w:val="24"/>
         </w:rPr>
       </w:pPr>
       <w:r>
@@ -4855,6 +3865,46 @@
           <w:rtl w:val="0"/>
         </w:rPr>
         <w:t xml:space="preserve">(B1).</w:t>
+        <w:br w:type="textWrapping"/>
+      </w:r>
+      <w:r>
+        <w:rPr>
+          <w:rFonts w:ascii="Calibri" w:cs="Calibri" w:eastAsia="Calibri" w:hAnsi="Calibri"/>
+          <w:b w:val="1"/>
+          <w:i w:val="0"/>
+          <w:smallCaps w:val="0"/>
+          <w:strike w:val="0"/>
+          <w:color w:val="000000"/>
+          <w:sz w:val="24"/>
+          <w:szCs w:val="24"/>
+          <w:u w:val="none"/>
+          <w:shd w:fill="auto" w:val="clear"/>
+          <w:vertAlign w:val="baseline"/>
+          <w:rtl w:val="0"/>
+        </w:rPr>
+        <w:t xml:space="preserve">Семейное положение</w:t>
+      </w:r>
+      <w:r>
+        <w:rPr>
+          <w:rFonts w:ascii="Calibri" w:cs="Calibri" w:eastAsia="Calibri" w:hAnsi="Calibri"/>
+          <w:b w:val="0"/>
+          <w:i w:val="0"/>
+          <w:smallCaps w:val="0"/>
+          <w:strike w:val="0"/>
+          <w:color w:val="000000"/>
+          <w:sz w:val="24"/>
+          <w:szCs w:val="24"/>
+          <w:u w:val="none"/>
+          <w:shd w:fill="auto" w:val="clear"/>
+          <w:vertAlign w:val="baseline"/>
+          <w:rtl w:val="0"/>
+        </w:rPr>
+        <w:t xml:space="preserve">: женат, ребенок 2 года.</w:t>
+      </w:r>
+      <w:r>
+        <w:rPr>
+          <w:rtl w:val="0"/>
+        </w:rPr>
       </w:r>
     </w:p>
     <w:p>
@@ -4873,364 +3923,6 @@
         <w:shd w:fill="auto" w:val="clear"/>
         <w:spacing w:after="0" w:before="0" w:line="240" w:lineRule="auto"/>
         <w:ind w:left="0" w:right="0" w:firstLine="0"/>
-        <w:jc w:val="left"/>
-        <w:rPr>
-          <w:rFonts w:ascii="Calibri" w:cs="Calibri" w:eastAsia="Calibri" w:hAnsi="Calibri"/>
-          <w:b w:val="0"/>
-          <w:i w:val="0"/>
-          <w:smallCaps w:val="0"/>
-          <w:strike w:val="0"/>
-          <w:color w:val="000000"/>
-          <w:sz w:val="24"/>
-          <w:szCs w:val="24"/>
-          <w:u w:val="none"/>
-          <w:shd w:fill="auto" w:val="clear"/>
-          <w:vertAlign w:val="baseline"/>
-        </w:rPr>
-      </w:pPr>
-      <w:r>
-        <w:rPr>
-          <w:rtl w:val="0"/>
-        </w:rPr>
-      </w:r>
-    </w:p>
-    <w:p>
-      <w:pPr>
-        <w:keepNext w:val="0"/>
-        <w:keepLines w:val="0"/>
-        <w:pageBreakBefore w:val="0"/>
-        <w:widowControl w:val="1"/>
-        <w:pBdr>
-          <w:top w:space="0" w:sz="0" w:val="nil"/>
-          <w:left w:space="0" w:sz="0" w:val="nil"/>
-          <w:bottom w:space="0" w:sz="0" w:val="nil"/>
-          <w:right w:space="0" w:sz="0" w:val="nil"/>
-          <w:between w:space="0" w:sz="0" w:val="nil"/>
-        </w:pBdr>
-        <w:shd w:fill="auto" w:val="clear"/>
-        <w:spacing w:after="0" w:before="0" w:line="240" w:lineRule="auto"/>
-        <w:ind w:left="0" w:right="0" w:firstLine="0"/>
-        <w:jc w:val="left"/>
-        <w:rPr>
-          <w:rFonts w:ascii="Calibri" w:cs="Calibri" w:eastAsia="Calibri" w:hAnsi="Calibri"/>
-          <w:b w:val="0"/>
-          <w:i w:val="0"/>
-          <w:smallCaps w:val="0"/>
-          <w:strike w:val="0"/>
-          <w:color w:val="000000"/>
-          <w:sz w:val="24"/>
-          <w:szCs w:val="24"/>
-          <w:u w:val="none"/>
-          <w:shd w:fill="auto" w:val="clear"/>
-          <w:vertAlign w:val="baseline"/>
-        </w:rPr>
-      </w:pPr>
-      <w:r>
-        <w:rPr>
-          <w:rFonts w:ascii="Calibri" w:cs="Calibri" w:eastAsia="Calibri" w:hAnsi="Calibri"/>
-          <w:b w:val="1"/>
-          <w:i w:val="0"/>
-          <w:smallCaps w:val="0"/>
-          <w:strike w:val="0"/>
-          <w:color w:val="000000"/>
-          <w:sz w:val="24"/>
-          <w:szCs w:val="24"/>
-          <w:u w:val="none"/>
-          <w:shd w:fill="auto" w:val="clear"/>
-          <w:vertAlign w:val="baseline"/>
-          <w:rtl w:val="0"/>
-        </w:rPr>
-        <w:t xml:space="preserve">Знание ПК:</w:t>
-      </w:r>
-      <w:r>
-        <w:rPr>
-          <w:rFonts w:ascii="Calibri" w:cs="Calibri" w:eastAsia="Calibri" w:hAnsi="Calibri"/>
-          <w:b w:val="0"/>
-          <w:i w:val="0"/>
-          <w:smallCaps w:val="0"/>
-          <w:strike w:val="0"/>
-          <w:color w:val="000000"/>
-          <w:sz w:val="24"/>
-          <w:szCs w:val="24"/>
-          <w:u w:val="none"/>
-          <w:shd w:fill="auto" w:val="clear"/>
-          <w:vertAlign w:val="baseline"/>
-          <w:rtl w:val="0"/>
-        </w:rPr>
-        <w:t xml:space="preserve"> на уровне системного администратора: ОС Windows, ОС Linux, </w:t>
-      </w:r>
-      <w:r>
-        <w:rPr>
-          <w:sz w:val="24"/>
-          <w:szCs w:val="24"/>
-          <w:rtl w:val="0"/>
-        </w:rPr>
-        <w:t xml:space="preserve">сервера LEMP, </w:t>
-      </w:r>
-      <w:r>
-        <w:rPr>
-          <w:rFonts w:ascii="Calibri" w:cs="Calibri" w:eastAsia="Calibri" w:hAnsi="Calibri"/>
-          <w:b w:val="0"/>
-          <w:i w:val="0"/>
-          <w:smallCaps w:val="0"/>
-          <w:strike w:val="0"/>
-          <w:color w:val="000000"/>
-          <w:sz w:val="24"/>
-          <w:szCs w:val="24"/>
-          <w:highlight w:val="white"/>
-          <w:u w:val="none"/>
-          <w:vertAlign w:val="baseline"/>
-          <w:rtl w:val="0"/>
-        </w:rPr>
-        <w:t xml:space="preserve">организация сетей, администрирование баз данных </w:t>
-      </w:r>
-      <w:r>
-        <w:rPr>
-          <w:sz w:val="24"/>
-          <w:szCs w:val="24"/>
-          <w:highlight w:val="white"/>
-          <w:rtl w:val="0"/>
-        </w:rPr>
-        <w:t xml:space="preserve">SQL</w:t>
-      </w:r>
-      <w:r>
-        <w:rPr>
-          <w:rFonts w:ascii="Calibri" w:cs="Calibri" w:eastAsia="Calibri" w:hAnsi="Calibri"/>
-          <w:b w:val="0"/>
-          <w:i w:val="0"/>
-          <w:smallCaps w:val="0"/>
-          <w:strike w:val="0"/>
-          <w:color w:val="000000"/>
-          <w:sz w:val="24"/>
-          <w:szCs w:val="24"/>
-          <w:highlight w:val="white"/>
-          <w:u w:val="none"/>
-          <w:vertAlign w:val="baseline"/>
-          <w:rtl w:val="0"/>
-        </w:rPr>
-        <w:t xml:space="preserve">, HTML, CSS, основы Java-Script, PHP, работа с графикой Adobe Photoshop, Adobe Illustrator</w:t>
-      </w:r>
-      <w:r>
-        <w:rPr>
-          <w:rFonts w:ascii="Calibri" w:cs="Calibri" w:eastAsia="Calibri" w:hAnsi="Calibri"/>
-          <w:b w:val="0"/>
-          <w:i w:val="0"/>
-          <w:smallCaps w:val="0"/>
-          <w:strike w:val="0"/>
-          <w:color w:val="000000"/>
-          <w:sz w:val="24"/>
-          <w:szCs w:val="24"/>
-          <w:u w:val="none"/>
-          <w:shd w:fill="auto" w:val="clear"/>
-          <w:vertAlign w:val="baseline"/>
-          <w:rtl w:val="0"/>
-        </w:rPr>
-        <w:t xml:space="preserve">. Разработка UI/UX дизайна. </w:t>
-      </w:r>
-      <w:r>
-        <w:rPr>
-          <w:sz w:val="24"/>
-          <w:szCs w:val="24"/>
-          <w:rtl w:val="0"/>
-        </w:rPr>
-        <w:t xml:space="preserve">О</w:t>
-      </w:r>
-      <w:r>
-        <w:rPr>
-          <w:rFonts w:ascii="Calibri" w:cs="Calibri" w:eastAsia="Calibri" w:hAnsi="Calibri"/>
-          <w:b w:val="0"/>
-          <w:i w:val="0"/>
-          <w:smallCaps w:val="0"/>
-          <w:strike w:val="0"/>
-          <w:color w:val="000000"/>
-          <w:sz w:val="24"/>
-          <w:szCs w:val="24"/>
-          <w:u w:val="none"/>
-          <w:shd w:fill="auto" w:val="clear"/>
-          <w:vertAlign w:val="baseline"/>
-          <w:rtl w:val="0"/>
-        </w:rPr>
-        <w:t xml:space="preserve">пыт работы с основными инструментами DevOps, такими как Docker, Kubernetes, GIT, Jenkins</w:t>
-      </w:r>
-      <w:r>
-        <w:rPr>
-          <w:sz w:val="24"/>
-          <w:szCs w:val="24"/>
-          <w:rtl w:val="0"/>
-        </w:rPr>
-        <w:t xml:space="preserve">, terraform. </w:t>
-      </w:r>
-      <w:r>
-        <w:rPr>
-          <w:rtl w:val="0"/>
-        </w:rPr>
-      </w:r>
-    </w:p>
-    <w:p>
-      <w:pPr>
-        <w:keepNext w:val="0"/>
-        <w:keepLines w:val="0"/>
-        <w:pageBreakBefore w:val="0"/>
-        <w:widowControl w:val="1"/>
-        <w:pBdr>
-          <w:top w:space="0" w:sz="0" w:val="nil"/>
-          <w:left w:space="0" w:sz="0" w:val="nil"/>
-          <w:bottom w:space="0" w:sz="0" w:val="nil"/>
-          <w:right w:space="0" w:sz="0" w:val="nil"/>
-          <w:between w:space="0" w:sz="0" w:val="nil"/>
-        </w:pBdr>
-        <w:shd w:fill="auto" w:val="clear"/>
-        <w:spacing w:after="0" w:before="0" w:line="240" w:lineRule="auto"/>
-        <w:ind w:left="0" w:right="0" w:firstLine="0"/>
-        <w:jc w:val="left"/>
-        <w:rPr>
-          <w:rFonts w:ascii="Calibri" w:cs="Calibri" w:eastAsia="Calibri" w:hAnsi="Calibri"/>
-          <w:b w:val="0"/>
-          <w:i w:val="0"/>
-          <w:smallCaps w:val="0"/>
-          <w:strike w:val="0"/>
-          <w:color w:val="000000"/>
-          <w:sz w:val="24"/>
-          <w:szCs w:val="24"/>
-          <w:u w:val="none"/>
-          <w:shd w:fill="auto" w:val="clear"/>
-          <w:vertAlign w:val="baseline"/>
-        </w:rPr>
-      </w:pPr>
-      <w:r>
-        <w:rPr>
-          <w:rFonts w:ascii="Calibri" w:cs="Calibri" w:eastAsia="Calibri" w:hAnsi="Calibri"/>
-          <w:b w:val="1"/>
-          <w:i w:val="0"/>
-          <w:smallCaps w:val="0"/>
-          <w:strike w:val="0"/>
-          <w:color w:val="000000"/>
-          <w:sz w:val="24"/>
-          <w:szCs w:val="24"/>
-          <w:u w:val="none"/>
-          <w:shd w:fill="auto" w:val="clear"/>
-          <w:vertAlign w:val="baseline"/>
-          <w:rtl w:val="0"/>
-        </w:rPr>
-        <w:t xml:space="preserve">Возраст: </w:t>
-      </w:r>
-      <w:r>
-        <w:rPr>
-          <w:rFonts w:ascii="Calibri" w:cs="Calibri" w:eastAsia="Calibri" w:hAnsi="Calibri"/>
-          <w:b w:val="0"/>
-          <w:i w:val="0"/>
-          <w:smallCaps w:val="0"/>
-          <w:strike w:val="0"/>
-          <w:color w:val="000000"/>
-          <w:sz w:val="24"/>
-          <w:szCs w:val="24"/>
-          <w:u w:val="none"/>
-          <w:shd w:fill="auto" w:val="clear"/>
-          <w:vertAlign w:val="baseline"/>
-          <w:rtl w:val="0"/>
-        </w:rPr>
-        <w:t xml:space="preserve">37 лет.</w:t>
-      </w:r>
-    </w:p>
-    <w:p>
-      <w:pPr>
-        <w:keepNext w:val="0"/>
-        <w:keepLines w:val="0"/>
-        <w:pageBreakBefore w:val="0"/>
-        <w:widowControl w:val="1"/>
-        <w:pBdr>
-          <w:top w:space="0" w:sz="0" w:val="nil"/>
-          <w:left w:space="0" w:sz="0" w:val="nil"/>
-          <w:bottom w:space="0" w:sz="0" w:val="nil"/>
-          <w:right w:space="0" w:sz="0" w:val="nil"/>
-          <w:between w:space="0" w:sz="0" w:val="nil"/>
-        </w:pBdr>
-        <w:shd w:fill="auto" w:val="clear"/>
-        <w:spacing w:after="0" w:before="0" w:line="240" w:lineRule="auto"/>
-        <w:ind w:left="0" w:right="0" w:firstLine="0"/>
-        <w:jc w:val="left"/>
-        <w:rPr>
-          <w:rFonts w:ascii="Calibri" w:cs="Calibri" w:eastAsia="Calibri" w:hAnsi="Calibri"/>
-          <w:b w:val="0"/>
-          <w:i w:val="0"/>
-          <w:smallCaps w:val="0"/>
-          <w:strike w:val="0"/>
-          <w:color w:val="000000"/>
-          <w:sz w:val="24"/>
-          <w:szCs w:val="24"/>
-          <w:u w:val="none"/>
-          <w:shd w:fill="auto" w:val="clear"/>
-          <w:vertAlign w:val="baseline"/>
-        </w:rPr>
-      </w:pPr>
-      <w:r>
-        <w:rPr>
-          <w:rFonts w:ascii="Calibri" w:cs="Calibri" w:eastAsia="Calibri" w:hAnsi="Calibri"/>
-          <w:b w:val="0"/>
-          <w:i w:val="0"/>
-          <w:smallCaps w:val="0"/>
-          <w:strike w:val="0"/>
-          <w:color w:val="000000"/>
-          <w:sz w:val="24"/>
-          <w:szCs w:val="24"/>
-          <w:u w:val="none"/>
-          <w:shd w:fill="auto" w:val="clear"/>
-          <w:vertAlign w:val="baseline"/>
-          <w:rtl w:val="0"/>
-        </w:rPr>
-        <w:br w:type="textWrapping"/>
-      </w:r>
-      <w:r>
-        <w:rPr>
-          <w:rFonts w:ascii="Calibri" w:cs="Calibri" w:eastAsia="Calibri" w:hAnsi="Calibri"/>
-          <w:b w:val="1"/>
-          <w:i w:val="0"/>
-          <w:smallCaps w:val="0"/>
-          <w:strike w:val="0"/>
-          <w:color w:val="000000"/>
-          <w:sz w:val="24"/>
-          <w:szCs w:val="24"/>
-          <w:u w:val="none"/>
-          <w:shd w:fill="auto" w:val="clear"/>
-          <w:vertAlign w:val="baseline"/>
-          <w:rtl w:val="0"/>
-        </w:rPr>
-        <w:t xml:space="preserve">Семейное положение</w:t>
-      </w:r>
-      <w:r>
-        <w:rPr>
-          <w:rFonts w:ascii="Calibri" w:cs="Calibri" w:eastAsia="Calibri" w:hAnsi="Calibri"/>
-          <w:b w:val="0"/>
-          <w:i w:val="0"/>
-          <w:smallCaps w:val="0"/>
-          <w:strike w:val="0"/>
-          <w:color w:val="000000"/>
-          <w:sz w:val="24"/>
-          <w:szCs w:val="24"/>
-          <w:u w:val="none"/>
-          <w:shd w:fill="auto" w:val="clear"/>
-          <w:vertAlign w:val="baseline"/>
-          <w:rtl w:val="0"/>
-        </w:rPr>
-        <w:t xml:space="preserve">: женат, ребенок 2 года.</w:t>
-      </w:r>
-    </w:p>
-    <w:p>
-      <w:pPr>
-        <w:keepNext w:val="0"/>
-        <w:keepLines w:val="0"/>
-        <w:pageBreakBefore w:val="0"/>
-        <w:widowControl w:val="1"/>
-        <w:pBdr>
-          <w:top w:space="0" w:sz="0" w:val="nil"/>
-          <w:left w:space="0" w:sz="0" w:val="nil"/>
-          <w:bottom w:space="0" w:sz="0" w:val="nil"/>
-          <w:right w:space="0" w:sz="0" w:val="nil"/>
-          <w:between w:space="0" w:sz="0" w:val="nil"/>
-        </w:pBdr>
-        <w:shd w:fill="auto" w:val="clear"/>
-        <w:spacing w:after="280" w:before="280" w:line="240" w:lineRule="auto"/>
-        <w:ind w:left="0" w:right="0" w:hanging="1"/>
         <w:jc w:val="left"/>
         <w:rPr>
           <w:rFonts w:ascii="Calibri" w:cs="Calibri" w:eastAsia="Calibri" w:hAnsi="Calibri"/>

</xml_diff>